<commit_message>
Add additional scripts + summary CSVs + sync latest docx
- scripts/baselines/: dispatch shell scripts (run_*, cbramod_dispatch, post_fusion_queue) used as references for the queue_runner.sh refactor
- scripts/baselines/: more baseline utilities (attn_zs_eval, build_unified_split, preprocess_mass, ensemble_cbramod, tinysleep_train_eval, zs_ms*)
- results/summaries/: hparam_summary.csv + sleepedf_ablation_summary*.csv (historical paper-prep data)
- docs/: sync latest PhyGProNet_Supervisor_Report.docx + add PhyGProNet_Experiments_Report.docx
</commit_message>
<xml_diff>
--- a/docs/PhyGProNet_Supervisor_Report.docx
+++ b/docs/PhyGProNet_Supervisor_Report.docx
@@ -1285,29 +1285,25 @@
     </w:p>
     <w:tbl>
       <w:tblPr>
-        <w:tblW w:type="dxa" w:w="9400"/>
-        <w:tblBorders>
-          <w:top w:val="single" w:color="auto" w:sz="4"/>
-          <w:left w:val="single" w:color="auto" w:sz="4"/>
-          <w:bottom w:val="single" w:color="auto" w:sz="4"/>
-          <w:right w:val="single" w:color="auto" w:sz="4"/>
-          <w:insideH w:val="single" w:color="auto" w:sz="4"/>
-          <w:insideV w:val="single" w:color="auto" w:sz="4"/>
-        </w:tblBorders>
+        <w:tblW w:type="dxa" w:w="10950"/>
+        <w:tblLayout w:type="fixed"/>
       </w:tblPr>
       <w:tblGrid>
-        <w:gridCol w:w="2300"/>
-        <w:gridCol w:w="1100"/>
-        <w:gridCol w:w="1800"/>
-        <w:gridCol w:w="1300"/>
-        <w:gridCol w:w="1300"/>
+        <w:gridCol w:w="1700"/>
         <w:gridCol w:w="800"/>
-        <w:gridCol w:w="800"/>
+        <w:gridCol w:w="1500"/>
+        <w:gridCol w:w="1500"/>
+        <w:gridCol w:w="1200"/>
+        <w:gridCol w:w="850"/>
+        <w:gridCol w:w="850"/>
+        <w:gridCol w:w="850"/>
+        <w:gridCol w:w="850"/>
+        <w:gridCol w:w="850"/>
       </w:tblGrid>
       <w:tr>
         <w:tc>
           <w:tcPr>
-            <w:tcW w:type="dxa" w:w="2300"/>
+            <w:tcW w:type="dxa" w:w="1700"/>
             <w:tcBorders>
               <w:top w:val="single" w:color="AAAAAA" w:sz="1"/>
               <w:left w:val="single" w:color="AAAAAA" w:sz="1"/>
@@ -1340,7 +1336,7 @@
         </w:tc>
         <w:tc>
           <w:tcPr>
-            <w:tcW w:type="dxa" w:w="1100"/>
+            <w:tcW w:type="dxa" w:w="800"/>
             <w:tcBorders>
               <w:top w:val="single" w:color="AAAAAA" w:sz="1"/>
               <w:left w:val="single" w:color="AAAAAA" w:sz="1"/>
@@ -1373,7 +1369,7 @@
         </w:tc>
         <w:tc>
           <w:tcPr>
-            <w:tcW w:type="dxa" w:w="1800"/>
+            <w:tcW w:type="dxa" w:w="1500"/>
             <w:tcBorders>
               <w:top w:val="single" w:color="AAAAAA" w:sz="1"/>
               <w:left w:val="single" w:color="AAAAAA" w:sz="1"/>
@@ -1406,7 +1402,7 @@
         </w:tc>
         <w:tc>
           <w:tcPr>
-            <w:tcW w:type="dxa" w:w="1300"/>
+            <w:tcW w:type="dxa" w:w="1500"/>
             <w:tcBorders>
               <w:top w:val="single" w:color="AAAAAA" w:sz="1"/>
               <w:left w:val="single" w:color="AAAAAA" w:sz="1"/>
@@ -1439,7 +1435,7 @@
         </w:tc>
         <w:tc>
           <w:tcPr>
-            <w:tcW w:type="dxa" w:w="1300"/>
+            <w:tcW w:type="dxa" w:w="1200"/>
             <w:tcBorders>
               <w:top w:val="single" w:color="AAAAAA" w:sz="1"/>
               <w:left w:val="single" w:color="AAAAAA" w:sz="1"/>
@@ -1472,7 +1468,7 @@
         </w:tc>
         <w:tc>
           <w:tcPr>
-            <w:tcW w:type="dxa" w:w="800"/>
+            <w:tcW w:type="dxa" w:w="850"/>
             <w:tcBorders>
               <w:top w:val="single" w:color="AAAAAA" w:sz="1"/>
               <w:left w:val="single" w:color="AAAAAA" w:sz="1"/>
@@ -1499,13 +1495,13 @@
                 <w:sz w:val="20"/>
                 <w:szCs w:val="20"/>
               </w:rPr>
-              <w:t xml:space="preserve">N1 F1</w:t>
-            </w:r>
-          </w:p>
-        </w:tc>
-        <w:tc>
-          <w:tcPr>
-            <w:tcW w:type="dxa" w:w="800"/>
+              <w:t xml:space="preserve">W</w:t>
+            </w:r>
+          </w:p>
+        </w:tc>
+        <w:tc>
+          <w:tcPr>
+            <w:tcW w:type="dxa" w:w="850"/>
             <w:tcBorders>
               <w:top w:val="single" w:color="AAAAAA" w:sz="1"/>
               <w:left w:val="single" w:color="AAAAAA" w:sz="1"/>
@@ -1532,7 +1528,106 @@
                 <w:sz w:val="20"/>
                 <w:szCs w:val="20"/>
               </w:rPr>
-              <w:t xml:space="preserve">N3 F1</w:t>
+              <w:t xml:space="preserve">N1</w:t>
+            </w:r>
+          </w:p>
+        </w:tc>
+        <w:tc>
+          <w:tcPr>
+            <w:tcW w:type="dxa" w:w="850"/>
+            <w:tcBorders>
+              <w:top w:val="single" w:color="AAAAAA" w:sz="1"/>
+              <w:left w:val="single" w:color="AAAAAA" w:sz="1"/>
+              <w:bottom w:val="single" w:color="AAAAAA" w:sz="1"/>
+              <w:right w:val="single" w:color="AAAAAA" w:sz="1"/>
+            </w:tcBorders>
+            <w:shd w:fill="D5E8F0" w:val="clear"/>
+            <w:tcMar>
+              <w:top w:type="dxa" w:w="70"/>
+              <w:left w:type="dxa" w:w="100"/>
+              <w:bottom w:type="dxa" w:w="70"/>
+              <w:right w:type="dxa" w:w="100"/>
+            </w:tcMar>
+          </w:tcPr>
+          <w:p>
+            <w:pPr>
+              <w:jc w:val="center"/>
+            </w:pPr>
+            <w:r>
+              <w:rPr>
+                <w:rFonts w:ascii="Arial" w:cs="Arial" w:eastAsia="Arial" w:hAnsi="Arial"/>
+                <w:b/>
+                <w:bCs/>
+                <w:sz w:val="20"/>
+                <w:szCs w:val="20"/>
+              </w:rPr>
+              <w:t xml:space="preserve">N2</w:t>
+            </w:r>
+          </w:p>
+        </w:tc>
+        <w:tc>
+          <w:tcPr>
+            <w:tcW w:type="dxa" w:w="850"/>
+            <w:tcBorders>
+              <w:top w:val="single" w:color="AAAAAA" w:sz="1"/>
+              <w:left w:val="single" w:color="AAAAAA" w:sz="1"/>
+              <w:bottom w:val="single" w:color="AAAAAA" w:sz="1"/>
+              <w:right w:val="single" w:color="AAAAAA" w:sz="1"/>
+            </w:tcBorders>
+            <w:shd w:fill="D5E8F0" w:val="clear"/>
+            <w:tcMar>
+              <w:top w:type="dxa" w:w="70"/>
+              <w:left w:type="dxa" w:w="100"/>
+              <w:bottom w:type="dxa" w:w="70"/>
+              <w:right w:type="dxa" w:w="100"/>
+            </w:tcMar>
+          </w:tcPr>
+          <w:p>
+            <w:pPr>
+              <w:jc w:val="center"/>
+            </w:pPr>
+            <w:r>
+              <w:rPr>
+                <w:rFonts w:ascii="Arial" w:cs="Arial" w:eastAsia="Arial" w:hAnsi="Arial"/>
+                <w:b/>
+                <w:bCs/>
+                <w:sz w:val="20"/>
+                <w:szCs w:val="20"/>
+              </w:rPr>
+              <w:t xml:space="preserve">N3</w:t>
+            </w:r>
+          </w:p>
+        </w:tc>
+        <w:tc>
+          <w:tcPr>
+            <w:tcW w:type="dxa" w:w="850"/>
+            <w:tcBorders>
+              <w:top w:val="single" w:color="AAAAAA" w:sz="1"/>
+              <w:left w:val="single" w:color="AAAAAA" w:sz="1"/>
+              <w:bottom w:val="single" w:color="AAAAAA" w:sz="1"/>
+              <w:right w:val="single" w:color="AAAAAA" w:sz="1"/>
+            </w:tcBorders>
+            <w:shd w:fill="D5E8F0" w:val="clear"/>
+            <w:tcMar>
+              <w:top w:type="dxa" w:w="70"/>
+              <w:left w:type="dxa" w:w="100"/>
+              <w:bottom w:type="dxa" w:w="70"/>
+              <w:right w:type="dxa" w:w="100"/>
+            </w:tcMar>
+          </w:tcPr>
+          <w:p>
+            <w:pPr>
+              <w:jc w:val="center"/>
+            </w:pPr>
+            <w:r>
+              <w:rPr>
+                <w:rFonts w:ascii="Arial" w:cs="Arial" w:eastAsia="Arial" w:hAnsi="Arial"/>
+                <w:b/>
+                <w:bCs/>
+                <w:sz w:val="20"/>
+                <w:szCs w:val="20"/>
+              </w:rPr>
+              <w:t xml:space="preserve">REM</w:t>
             </w:r>
           </w:p>
         </w:tc>
@@ -1540,7 +1635,7 @@
       <w:tr>
         <w:tc>
           <w:tcPr>
-            <w:tcW w:type="dxa" w:w="2300"/>
+            <w:tcW w:type="dxa" w:w="1700"/>
             <w:tcBorders>
               <w:top w:val="single" w:color="AAAAAA" w:sz="1"/>
               <w:left w:val="single" w:color="AAAAAA" w:sz="1"/>
@@ -1570,7 +1665,7 @@
         </w:tc>
         <w:tc>
           <w:tcPr>
-            <w:tcW w:type="dxa" w:w="1100"/>
+            <w:tcW w:type="dxa" w:w="800"/>
             <w:tcBorders>
               <w:top w:val="single" w:color="AAAAAA" w:sz="1"/>
               <w:left w:val="single" w:color="AAAAAA" w:sz="1"/>
@@ -1600,7 +1695,7 @@
         </w:tc>
         <w:tc>
           <w:tcPr>
-            <w:tcW w:type="dxa" w:w="1800"/>
+            <w:tcW w:type="dxa" w:w="1500"/>
             <w:tcBorders>
               <w:top w:val="single" w:color="AAAAAA" w:sz="1"/>
               <w:left w:val="single" w:color="AAAAAA" w:sz="1"/>
@@ -1630,7 +1725,7 @@
         </w:tc>
         <w:tc>
           <w:tcPr>
-            <w:tcW w:type="dxa" w:w="1300"/>
+            <w:tcW w:type="dxa" w:w="1500"/>
             <w:tcBorders>
               <w:top w:val="single" w:color="AAAAAA" w:sz="1"/>
               <w:left w:val="single" w:color="AAAAAA" w:sz="1"/>
@@ -1660,7 +1755,7 @@
         </w:tc>
         <w:tc>
           <w:tcPr>
-            <w:tcW w:type="dxa" w:w="1300"/>
+            <w:tcW w:type="dxa" w:w="1200"/>
             <w:tcBorders>
               <w:top w:val="single" w:color="AAAAAA" w:sz="1"/>
               <w:left w:val="single" w:color="AAAAAA" w:sz="1"/>
@@ -1690,61 +1785,151 @@
         </w:tc>
         <w:tc>
           <w:tcPr>
-            <w:tcW w:type="dxa" w:w="800"/>
-            <w:tcBorders>
-              <w:top w:val="single" w:color="AAAAAA" w:sz="1"/>
-              <w:left w:val="single" w:color="AAAAAA" w:sz="1"/>
-              <w:bottom w:val="single" w:color="AAAAAA" w:sz="1"/>
-              <w:right w:val="single" w:color="AAAAAA" w:sz="1"/>
-            </w:tcBorders>
-            <w:tcMar>
-              <w:top w:type="dxa" w:w="70"/>
-              <w:left w:type="dxa" w:w="100"/>
-              <w:bottom w:type="dxa" w:w="70"/>
-              <w:right w:type="dxa" w:w="100"/>
-            </w:tcMar>
-          </w:tcPr>
-          <w:p>
-            <w:pPr>
-              <w:jc w:val="center"/>
-            </w:pPr>
-            <w:r>
-              <w:rPr>
-                <w:rFonts w:ascii="Arial" w:cs="Arial" w:eastAsia="Arial" w:hAnsi="Arial"/>
-                <w:sz w:val="20"/>
-                <w:szCs w:val="20"/>
-              </w:rPr>
-              <w:t xml:space="preserve">0.348</w:t>
-            </w:r>
-          </w:p>
-        </w:tc>
-        <w:tc>
-          <w:tcPr>
-            <w:tcW w:type="dxa" w:w="800"/>
-            <w:tcBorders>
-              <w:top w:val="single" w:color="AAAAAA" w:sz="1"/>
-              <w:left w:val="single" w:color="AAAAAA" w:sz="1"/>
-              <w:bottom w:val="single" w:color="AAAAAA" w:sz="1"/>
-              <w:right w:val="single" w:color="AAAAAA" w:sz="1"/>
-            </w:tcBorders>
-            <w:tcMar>
-              <w:top w:type="dxa" w:w="70"/>
-              <w:left w:type="dxa" w:w="100"/>
-              <w:bottom w:type="dxa" w:w="70"/>
-              <w:right w:type="dxa" w:w="100"/>
-            </w:tcMar>
-          </w:tcPr>
-          <w:p>
-            <w:pPr>
-              <w:jc w:val="center"/>
-            </w:pPr>
-            <w:r>
-              <w:rPr>
-                <w:rFonts w:ascii="Arial" w:cs="Arial" w:eastAsia="Arial" w:hAnsi="Arial"/>
-                <w:sz w:val="20"/>
-                <w:szCs w:val="20"/>
-              </w:rPr>
-              <w:t xml:space="preserve">0.783</w:t>
+            <w:tcW w:type="dxa" w:w="850"/>
+            <w:tcBorders>
+              <w:top w:val="single" w:color="AAAAAA" w:sz="1"/>
+              <w:left w:val="single" w:color="AAAAAA" w:sz="1"/>
+              <w:bottom w:val="single" w:color="AAAAAA" w:sz="1"/>
+              <w:right w:val="single" w:color="AAAAAA" w:sz="1"/>
+            </w:tcBorders>
+            <w:tcMar>
+              <w:top w:type="dxa" w:w="70"/>
+              <w:left w:type="dxa" w:w="100"/>
+              <w:bottom w:type="dxa" w:w="70"/>
+              <w:right w:type="dxa" w:w="100"/>
+            </w:tcMar>
+          </w:tcPr>
+          <w:p>
+            <w:pPr>
+              <w:jc w:val="center"/>
+            </w:pPr>
+            <w:r>
+              <w:rPr>
+                <w:rFonts w:ascii="Arial" w:cs="Arial" w:eastAsia="Arial" w:hAnsi="Arial"/>
+                <w:sz w:val="20"/>
+                <w:szCs w:val="20"/>
+              </w:rPr>
+              <w:t xml:space="preserve">0.978 ± 0.005</w:t>
+            </w:r>
+          </w:p>
+        </w:tc>
+        <w:tc>
+          <w:tcPr>
+            <w:tcW w:type="dxa" w:w="850"/>
+            <w:tcBorders>
+              <w:top w:val="single" w:color="AAAAAA" w:sz="1"/>
+              <w:left w:val="single" w:color="AAAAAA" w:sz="1"/>
+              <w:bottom w:val="single" w:color="AAAAAA" w:sz="1"/>
+              <w:right w:val="single" w:color="AAAAAA" w:sz="1"/>
+            </w:tcBorders>
+            <w:tcMar>
+              <w:top w:type="dxa" w:w="70"/>
+              <w:left w:type="dxa" w:w="100"/>
+              <w:bottom w:type="dxa" w:w="70"/>
+              <w:right w:type="dxa" w:w="100"/>
+            </w:tcMar>
+          </w:tcPr>
+          <w:p>
+            <w:pPr>
+              <w:jc w:val="center"/>
+            </w:pPr>
+            <w:r>
+              <w:rPr>
+                <w:rFonts w:ascii="Arial" w:cs="Arial" w:eastAsia="Arial" w:hAnsi="Arial"/>
+                <w:sz w:val="20"/>
+                <w:szCs w:val="20"/>
+              </w:rPr>
+              <w:t xml:space="preserve">0.348 ± 0.040</w:t>
+            </w:r>
+          </w:p>
+        </w:tc>
+        <w:tc>
+          <w:tcPr>
+            <w:tcW w:type="dxa" w:w="850"/>
+            <w:tcBorders>
+              <w:top w:val="single" w:color="AAAAAA" w:sz="1"/>
+              <w:left w:val="single" w:color="AAAAAA" w:sz="1"/>
+              <w:bottom w:val="single" w:color="AAAAAA" w:sz="1"/>
+              <w:right w:val="single" w:color="AAAAAA" w:sz="1"/>
+            </w:tcBorders>
+            <w:tcMar>
+              <w:top w:type="dxa" w:w="70"/>
+              <w:left w:type="dxa" w:w="100"/>
+              <w:bottom w:type="dxa" w:w="70"/>
+              <w:right w:type="dxa" w:w="100"/>
+            </w:tcMar>
+          </w:tcPr>
+          <w:p>
+            <w:pPr>
+              <w:jc w:val="center"/>
+            </w:pPr>
+            <w:r>
+              <w:rPr>
+                <w:rFonts w:ascii="Arial" w:cs="Arial" w:eastAsia="Arial" w:hAnsi="Arial"/>
+                <w:sz w:val="20"/>
+                <w:szCs w:val="20"/>
+              </w:rPr>
+              <w:t xml:space="preserve">0.837 ± 0.028</w:t>
+            </w:r>
+          </w:p>
+        </w:tc>
+        <w:tc>
+          <w:tcPr>
+            <w:tcW w:type="dxa" w:w="850"/>
+            <w:tcBorders>
+              <w:top w:val="single" w:color="AAAAAA" w:sz="1"/>
+              <w:left w:val="single" w:color="AAAAAA" w:sz="1"/>
+              <w:bottom w:val="single" w:color="AAAAAA" w:sz="1"/>
+              <w:right w:val="single" w:color="AAAAAA" w:sz="1"/>
+            </w:tcBorders>
+            <w:tcMar>
+              <w:top w:type="dxa" w:w="70"/>
+              <w:left w:type="dxa" w:w="100"/>
+              <w:bottom w:type="dxa" w:w="70"/>
+              <w:right w:type="dxa" w:w="100"/>
+            </w:tcMar>
+          </w:tcPr>
+          <w:p>
+            <w:pPr>
+              <w:jc w:val="center"/>
+            </w:pPr>
+            <w:r>
+              <w:rPr>
+                <w:rFonts w:ascii="Arial" w:cs="Arial" w:eastAsia="Arial" w:hAnsi="Arial"/>
+                <w:sz w:val="20"/>
+                <w:szCs w:val="20"/>
+              </w:rPr>
+              <w:t xml:space="preserve">0.783 ± 0.050</w:t>
+            </w:r>
+          </w:p>
+        </w:tc>
+        <w:tc>
+          <w:tcPr>
+            <w:tcW w:type="dxa" w:w="850"/>
+            <w:tcBorders>
+              <w:top w:val="single" w:color="AAAAAA" w:sz="1"/>
+              <w:left w:val="single" w:color="AAAAAA" w:sz="1"/>
+              <w:bottom w:val="single" w:color="AAAAAA" w:sz="1"/>
+              <w:right w:val="single" w:color="AAAAAA" w:sz="1"/>
+            </w:tcBorders>
+            <w:tcMar>
+              <w:top w:type="dxa" w:w="70"/>
+              <w:left w:type="dxa" w:w="100"/>
+              <w:bottom w:type="dxa" w:w="70"/>
+              <w:right w:type="dxa" w:w="100"/>
+            </w:tcMar>
+          </w:tcPr>
+          <w:p>
+            <w:pPr>
+              <w:jc w:val="center"/>
+            </w:pPr>
+            <w:r>
+              <w:rPr>
+                <w:rFonts w:ascii="Arial" w:cs="Arial" w:eastAsia="Arial" w:hAnsi="Arial"/>
+                <w:sz w:val="20"/>
+                <w:szCs w:val="20"/>
+              </w:rPr>
+              <w:t xml:space="preserve">0.687 ± 0.050</w:t>
             </w:r>
           </w:p>
         </w:tc>
@@ -1752,7 +1937,7 @@
       <w:tr>
         <w:tc>
           <w:tcPr>
-            <w:tcW w:type="dxa" w:w="2300"/>
+            <w:tcW w:type="dxa" w:w="1700"/>
             <w:tcBorders>
               <w:top w:val="single" w:color="AAAAAA" w:sz="1"/>
               <w:left w:val="single" w:color="AAAAAA" w:sz="1"/>
@@ -1782,7 +1967,7 @@
         </w:tc>
         <w:tc>
           <w:tcPr>
-            <w:tcW w:type="dxa" w:w="1100"/>
+            <w:tcW w:type="dxa" w:w="800"/>
             <w:tcBorders>
               <w:top w:val="single" w:color="AAAAAA" w:sz="1"/>
               <w:left w:val="single" w:color="AAAAAA" w:sz="1"/>
@@ -1812,7 +1997,7 @@
         </w:tc>
         <w:tc>
           <w:tcPr>
-            <w:tcW w:type="dxa" w:w="1800"/>
+            <w:tcW w:type="dxa" w:w="1500"/>
             <w:tcBorders>
               <w:top w:val="single" w:color="AAAAAA" w:sz="1"/>
               <w:left w:val="single" w:color="AAAAAA" w:sz="1"/>
@@ -1842,7 +2027,7 @@
         </w:tc>
         <w:tc>
           <w:tcPr>
-            <w:tcW w:type="dxa" w:w="1300"/>
+            <w:tcW w:type="dxa" w:w="1500"/>
             <w:tcBorders>
               <w:top w:val="single" w:color="AAAAAA" w:sz="1"/>
               <w:left w:val="single" w:color="AAAAAA" w:sz="1"/>
@@ -1872,7 +2057,7 @@
         </w:tc>
         <w:tc>
           <w:tcPr>
-            <w:tcW w:type="dxa" w:w="1300"/>
+            <w:tcW w:type="dxa" w:w="1200"/>
             <w:tcBorders>
               <w:top w:val="single" w:color="AAAAAA" w:sz="1"/>
               <w:left w:val="single" w:color="AAAAAA" w:sz="1"/>
@@ -1902,61 +2087,151 @@
         </w:tc>
         <w:tc>
           <w:tcPr>
-            <w:tcW w:type="dxa" w:w="800"/>
-            <w:tcBorders>
-              <w:top w:val="single" w:color="AAAAAA" w:sz="1"/>
-              <w:left w:val="single" w:color="AAAAAA" w:sz="1"/>
-              <w:bottom w:val="single" w:color="AAAAAA" w:sz="1"/>
-              <w:right w:val="single" w:color="AAAAAA" w:sz="1"/>
-            </w:tcBorders>
-            <w:tcMar>
-              <w:top w:type="dxa" w:w="70"/>
-              <w:left w:type="dxa" w:w="100"/>
-              <w:bottom w:type="dxa" w:w="70"/>
-              <w:right w:type="dxa" w:w="100"/>
-            </w:tcMar>
-          </w:tcPr>
-          <w:p>
-            <w:pPr>
-              <w:jc w:val="center"/>
-            </w:pPr>
-            <w:r>
-              <w:rPr>
-                <w:rFonts w:ascii="Arial" w:cs="Arial" w:eastAsia="Arial" w:hAnsi="Arial"/>
-                <w:sz w:val="20"/>
-                <w:szCs w:val="20"/>
-              </w:rPr>
-              <w:t xml:space="preserve">0.297</w:t>
-            </w:r>
-          </w:p>
-        </w:tc>
-        <w:tc>
-          <w:tcPr>
-            <w:tcW w:type="dxa" w:w="800"/>
-            <w:tcBorders>
-              <w:top w:val="single" w:color="AAAAAA" w:sz="1"/>
-              <w:left w:val="single" w:color="AAAAAA" w:sz="1"/>
-              <w:bottom w:val="single" w:color="AAAAAA" w:sz="1"/>
-              <w:right w:val="single" w:color="AAAAAA" w:sz="1"/>
-            </w:tcBorders>
-            <w:tcMar>
-              <w:top w:type="dxa" w:w="70"/>
-              <w:left w:type="dxa" w:w="100"/>
-              <w:bottom w:type="dxa" w:w="70"/>
-              <w:right w:type="dxa" w:w="100"/>
-            </w:tcMar>
-          </w:tcPr>
-          <w:p>
-            <w:pPr>
-              <w:jc w:val="center"/>
-            </w:pPr>
-            <w:r>
-              <w:rPr>
-                <w:rFonts w:ascii="Arial" w:cs="Arial" w:eastAsia="Arial" w:hAnsi="Arial"/>
-                <w:sz w:val="20"/>
-                <w:szCs w:val="20"/>
-              </w:rPr>
-              <w:t xml:space="preserve">0.760</w:t>
+            <w:tcW w:type="dxa" w:w="850"/>
+            <w:tcBorders>
+              <w:top w:val="single" w:color="AAAAAA" w:sz="1"/>
+              <w:left w:val="single" w:color="AAAAAA" w:sz="1"/>
+              <w:bottom w:val="single" w:color="AAAAAA" w:sz="1"/>
+              <w:right w:val="single" w:color="AAAAAA" w:sz="1"/>
+            </w:tcBorders>
+            <w:tcMar>
+              <w:top w:type="dxa" w:w="70"/>
+              <w:left w:type="dxa" w:w="100"/>
+              <w:bottom w:type="dxa" w:w="70"/>
+              <w:right w:type="dxa" w:w="100"/>
+            </w:tcMar>
+          </w:tcPr>
+          <w:p>
+            <w:pPr>
+              <w:jc w:val="center"/>
+            </w:pPr>
+            <w:r>
+              <w:rPr>
+                <w:rFonts w:ascii="Arial" w:cs="Arial" w:eastAsia="Arial" w:hAnsi="Arial"/>
+                <w:sz w:val="20"/>
+                <w:szCs w:val="20"/>
+              </w:rPr>
+              <w:t xml:space="preserve">0.976 ± 0.005</w:t>
+            </w:r>
+          </w:p>
+        </w:tc>
+        <w:tc>
+          <w:tcPr>
+            <w:tcW w:type="dxa" w:w="850"/>
+            <w:tcBorders>
+              <w:top w:val="single" w:color="AAAAAA" w:sz="1"/>
+              <w:left w:val="single" w:color="AAAAAA" w:sz="1"/>
+              <w:bottom w:val="single" w:color="AAAAAA" w:sz="1"/>
+              <w:right w:val="single" w:color="AAAAAA" w:sz="1"/>
+            </w:tcBorders>
+            <w:tcMar>
+              <w:top w:type="dxa" w:w="70"/>
+              <w:left w:type="dxa" w:w="100"/>
+              <w:bottom w:type="dxa" w:w="70"/>
+              <w:right w:type="dxa" w:w="100"/>
+            </w:tcMar>
+          </w:tcPr>
+          <w:p>
+            <w:pPr>
+              <w:jc w:val="center"/>
+            </w:pPr>
+            <w:r>
+              <w:rPr>
+                <w:rFonts w:ascii="Arial" w:cs="Arial" w:eastAsia="Arial" w:hAnsi="Arial"/>
+                <w:sz w:val="20"/>
+                <w:szCs w:val="20"/>
+              </w:rPr>
+              <w:t xml:space="preserve">0.297 ± 0.034</w:t>
+            </w:r>
+          </w:p>
+        </w:tc>
+        <w:tc>
+          <w:tcPr>
+            <w:tcW w:type="dxa" w:w="850"/>
+            <w:tcBorders>
+              <w:top w:val="single" w:color="AAAAAA" w:sz="1"/>
+              <w:left w:val="single" w:color="AAAAAA" w:sz="1"/>
+              <w:bottom w:val="single" w:color="AAAAAA" w:sz="1"/>
+              <w:right w:val="single" w:color="AAAAAA" w:sz="1"/>
+            </w:tcBorders>
+            <w:tcMar>
+              <w:top w:type="dxa" w:w="70"/>
+              <w:left w:type="dxa" w:w="100"/>
+              <w:bottom w:type="dxa" w:w="70"/>
+              <w:right w:type="dxa" w:w="100"/>
+            </w:tcMar>
+          </w:tcPr>
+          <w:p>
+            <w:pPr>
+              <w:jc w:val="center"/>
+            </w:pPr>
+            <w:r>
+              <w:rPr>
+                <w:rFonts w:ascii="Arial" w:cs="Arial" w:eastAsia="Arial" w:hAnsi="Arial"/>
+                <w:sz w:val="20"/>
+                <w:szCs w:val="20"/>
+              </w:rPr>
+              <w:t xml:space="preserve">0.836 ± 0.030</w:t>
+            </w:r>
+          </w:p>
+        </w:tc>
+        <w:tc>
+          <w:tcPr>
+            <w:tcW w:type="dxa" w:w="850"/>
+            <w:tcBorders>
+              <w:top w:val="single" w:color="AAAAAA" w:sz="1"/>
+              <w:left w:val="single" w:color="AAAAAA" w:sz="1"/>
+              <w:bottom w:val="single" w:color="AAAAAA" w:sz="1"/>
+              <w:right w:val="single" w:color="AAAAAA" w:sz="1"/>
+            </w:tcBorders>
+            <w:tcMar>
+              <w:top w:type="dxa" w:w="70"/>
+              <w:left w:type="dxa" w:w="100"/>
+              <w:bottom w:type="dxa" w:w="70"/>
+              <w:right w:type="dxa" w:w="100"/>
+            </w:tcMar>
+          </w:tcPr>
+          <w:p>
+            <w:pPr>
+              <w:jc w:val="center"/>
+            </w:pPr>
+            <w:r>
+              <w:rPr>
+                <w:rFonts w:ascii="Arial" w:cs="Arial" w:eastAsia="Arial" w:hAnsi="Arial"/>
+                <w:sz w:val="20"/>
+                <w:szCs w:val="20"/>
+              </w:rPr>
+              <w:t xml:space="preserve">0.760 ± 0.060</w:t>
+            </w:r>
+          </w:p>
+        </w:tc>
+        <w:tc>
+          <w:tcPr>
+            <w:tcW w:type="dxa" w:w="850"/>
+            <w:tcBorders>
+              <w:top w:val="single" w:color="AAAAAA" w:sz="1"/>
+              <w:left w:val="single" w:color="AAAAAA" w:sz="1"/>
+              <w:bottom w:val="single" w:color="AAAAAA" w:sz="1"/>
+              <w:right w:val="single" w:color="AAAAAA" w:sz="1"/>
+            </w:tcBorders>
+            <w:tcMar>
+              <w:top w:type="dxa" w:w="70"/>
+              <w:left w:type="dxa" w:w="100"/>
+              <w:bottom w:type="dxa" w:w="70"/>
+              <w:right w:type="dxa" w:w="100"/>
+            </w:tcMar>
+          </w:tcPr>
+          <w:p>
+            <w:pPr>
+              <w:jc w:val="center"/>
+            </w:pPr>
+            <w:r>
+              <w:rPr>
+                <w:rFonts w:ascii="Arial" w:cs="Arial" w:eastAsia="Arial" w:hAnsi="Arial"/>
+                <w:sz w:val="20"/>
+                <w:szCs w:val="20"/>
+              </w:rPr>
+              <w:t xml:space="preserve">0.652 ± 0.052</w:t>
             </w:r>
           </w:p>
         </w:tc>
@@ -1964,7 +2239,7 @@
       <w:tr>
         <w:tc>
           <w:tcPr>
-            <w:tcW w:type="dxa" w:w="2300"/>
+            <w:tcW w:type="dxa" w:w="1700"/>
             <w:tcBorders>
               <w:top w:val="single" w:color="AAAAAA" w:sz="1"/>
               <w:left w:val="single" w:color="AAAAAA" w:sz="1"/>
@@ -1994,7 +2269,7 @@
         </w:tc>
         <w:tc>
           <w:tcPr>
-            <w:tcW w:type="dxa" w:w="1100"/>
+            <w:tcW w:type="dxa" w:w="800"/>
             <w:tcBorders>
               <w:top w:val="single" w:color="AAAAAA" w:sz="1"/>
               <w:left w:val="single" w:color="AAAAAA" w:sz="1"/>
@@ -2024,7 +2299,7 @@
         </w:tc>
         <w:tc>
           <w:tcPr>
-            <w:tcW w:type="dxa" w:w="1800"/>
+            <w:tcW w:type="dxa" w:w="1500"/>
             <w:tcBorders>
               <w:top w:val="single" w:color="AAAAAA" w:sz="1"/>
               <w:left w:val="single" w:color="AAAAAA" w:sz="1"/>
@@ -2054,7 +2329,7 @@
         </w:tc>
         <w:tc>
           <w:tcPr>
-            <w:tcW w:type="dxa" w:w="1300"/>
+            <w:tcW w:type="dxa" w:w="1500"/>
             <w:tcBorders>
               <w:top w:val="single" w:color="AAAAAA" w:sz="1"/>
               <w:left w:val="single" w:color="AAAAAA" w:sz="1"/>
@@ -2084,7 +2359,7 @@
         </w:tc>
         <w:tc>
           <w:tcPr>
-            <w:tcW w:type="dxa" w:w="1300"/>
+            <w:tcW w:type="dxa" w:w="1200"/>
             <w:tcBorders>
               <w:top w:val="single" w:color="AAAAAA" w:sz="1"/>
               <w:left w:val="single" w:color="AAAAAA" w:sz="1"/>
@@ -2114,61 +2389,151 @@
         </w:tc>
         <w:tc>
           <w:tcPr>
-            <w:tcW w:type="dxa" w:w="800"/>
-            <w:tcBorders>
-              <w:top w:val="single" w:color="AAAAAA" w:sz="1"/>
-              <w:left w:val="single" w:color="AAAAAA" w:sz="1"/>
-              <w:bottom w:val="single" w:color="AAAAAA" w:sz="1"/>
-              <w:right w:val="single" w:color="AAAAAA" w:sz="1"/>
-            </w:tcBorders>
-            <w:tcMar>
-              <w:top w:type="dxa" w:w="70"/>
-              <w:left w:type="dxa" w:w="100"/>
-              <w:bottom w:type="dxa" w:w="70"/>
-              <w:right w:type="dxa" w:w="100"/>
-            </w:tcMar>
-          </w:tcPr>
-          <w:p>
-            <w:pPr>
-              <w:jc w:val="center"/>
-            </w:pPr>
-            <w:r>
-              <w:rPr>
-                <w:rFonts w:ascii="Arial" w:cs="Arial" w:eastAsia="Arial" w:hAnsi="Arial"/>
-                <w:sz w:val="20"/>
-                <w:szCs w:val="20"/>
-              </w:rPr>
-              <w:t xml:space="preserve">0.181</w:t>
-            </w:r>
-          </w:p>
-        </w:tc>
-        <w:tc>
-          <w:tcPr>
-            <w:tcW w:type="dxa" w:w="800"/>
-            <w:tcBorders>
-              <w:top w:val="single" w:color="AAAAAA" w:sz="1"/>
-              <w:left w:val="single" w:color="AAAAAA" w:sz="1"/>
-              <w:bottom w:val="single" w:color="AAAAAA" w:sz="1"/>
-              <w:right w:val="single" w:color="AAAAAA" w:sz="1"/>
-            </w:tcBorders>
-            <w:tcMar>
-              <w:top w:type="dxa" w:w="70"/>
-              <w:left w:type="dxa" w:w="100"/>
-              <w:bottom w:type="dxa" w:w="70"/>
-              <w:right w:type="dxa" w:w="100"/>
-            </w:tcMar>
-          </w:tcPr>
-          <w:p>
-            <w:pPr>
-              <w:jc w:val="center"/>
-            </w:pPr>
-            <w:r>
-              <w:rPr>
-                <w:rFonts w:ascii="Arial" w:cs="Arial" w:eastAsia="Arial" w:hAnsi="Arial"/>
-                <w:sz w:val="20"/>
-                <w:szCs w:val="20"/>
-              </w:rPr>
-              <w:t xml:space="preserve">0.303</w:t>
+            <w:tcW w:type="dxa" w:w="850"/>
+            <w:tcBorders>
+              <w:top w:val="single" w:color="AAAAAA" w:sz="1"/>
+              <w:left w:val="single" w:color="AAAAAA" w:sz="1"/>
+              <w:bottom w:val="single" w:color="AAAAAA" w:sz="1"/>
+              <w:right w:val="single" w:color="AAAAAA" w:sz="1"/>
+            </w:tcBorders>
+            <w:tcMar>
+              <w:top w:type="dxa" w:w="70"/>
+              <w:left w:type="dxa" w:w="100"/>
+              <w:bottom w:type="dxa" w:w="70"/>
+              <w:right w:type="dxa" w:w="100"/>
+            </w:tcMar>
+          </w:tcPr>
+          <w:p>
+            <w:pPr>
+              <w:jc w:val="center"/>
+            </w:pPr>
+            <w:r>
+              <w:rPr>
+                <w:rFonts w:ascii="Arial" w:cs="Arial" w:eastAsia="Arial" w:hAnsi="Arial"/>
+                <w:sz w:val="20"/>
+                <w:szCs w:val="20"/>
+              </w:rPr>
+              <w:t xml:space="preserve">0.920 ± 0.044</w:t>
+            </w:r>
+          </w:p>
+        </w:tc>
+        <w:tc>
+          <w:tcPr>
+            <w:tcW w:type="dxa" w:w="850"/>
+            <w:tcBorders>
+              <w:top w:val="single" w:color="AAAAAA" w:sz="1"/>
+              <w:left w:val="single" w:color="AAAAAA" w:sz="1"/>
+              <w:bottom w:val="single" w:color="AAAAAA" w:sz="1"/>
+              <w:right w:val="single" w:color="AAAAAA" w:sz="1"/>
+            </w:tcBorders>
+            <w:tcMar>
+              <w:top w:type="dxa" w:w="70"/>
+              <w:left w:type="dxa" w:w="100"/>
+              <w:bottom w:type="dxa" w:w="70"/>
+              <w:right w:type="dxa" w:w="100"/>
+            </w:tcMar>
+          </w:tcPr>
+          <w:p>
+            <w:pPr>
+              <w:jc w:val="center"/>
+            </w:pPr>
+            <w:r>
+              <w:rPr>
+                <w:rFonts w:ascii="Arial" w:cs="Arial" w:eastAsia="Arial" w:hAnsi="Arial"/>
+                <w:sz w:val="20"/>
+                <w:szCs w:val="20"/>
+              </w:rPr>
+              <w:t xml:space="preserve">0.181 ± 0.100</w:t>
+            </w:r>
+          </w:p>
+        </w:tc>
+        <w:tc>
+          <w:tcPr>
+            <w:tcW w:type="dxa" w:w="850"/>
+            <w:tcBorders>
+              <w:top w:val="single" w:color="AAAAAA" w:sz="1"/>
+              <w:left w:val="single" w:color="AAAAAA" w:sz="1"/>
+              <w:bottom w:val="single" w:color="AAAAAA" w:sz="1"/>
+              <w:right w:val="single" w:color="AAAAAA" w:sz="1"/>
+            </w:tcBorders>
+            <w:tcMar>
+              <w:top w:type="dxa" w:w="70"/>
+              <w:left w:type="dxa" w:w="100"/>
+              <w:bottom w:type="dxa" w:w="70"/>
+              <w:right w:type="dxa" w:w="100"/>
+            </w:tcMar>
+          </w:tcPr>
+          <w:p>
+            <w:pPr>
+              <w:jc w:val="center"/>
+            </w:pPr>
+            <w:r>
+              <w:rPr>
+                <w:rFonts w:ascii="Arial" w:cs="Arial" w:eastAsia="Arial" w:hAnsi="Arial"/>
+                <w:sz w:val="20"/>
+                <w:szCs w:val="20"/>
+              </w:rPr>
+              <w:t xml:space="preserve">0.661 ± 0.054</w:t>
+            </w:r>
+          </w:p>
+        </w:tc>
+        <w:tc>
+          <w:tcPr>
+            <w:tcW w:type="dxa" w:w="850"/>
+            <w:tcBorders>
+              <w:top w:val="single" w:color="AAAAAA" w:sz="1"/>
+              <w:left w:val="single" w:color="AAAAAA" w:sz="1"/>
+              <w:bottom w:val="single" w:color="AAAAAA" w:sz="1"/>
+              <w:right w:val="single" w:color="AAAAAA" w:sz="1"/>
+            </w:tcBorders>
+            <w:tcMar>
+              <w:top w:type="dxa" w:w="70"/>
+              <w:left w:type="dxa" w:w="100"/>
+              <w:bottom w:type="dxa" w:w="70"/>
+              <w:right w:type="dxa" w:w="100"/>
+            </w:tcMar>
+          </w:tcPr>
+          <w:p>
+            <w:pPr>
+              <w:jc w:val="center"/>
+            </w:pPr>
+            <w:r>
+              <w:rPr>
+                <w:rFonts w:ascii="Arial" w:cs="Arial" w:eastAsia="Arial" w:hAnsi="Arial"/>
+                <w:sz w:val="20"/>
+                <w:szCs w:val="20"/>
+              </w:rPr>
+              <w:t xml:space="preserve">0.303 ± 0.214</w:t>
+            </w:r>
+          </w:p>
+        </w:tc>
+        <w:tc>
+          <w:tcPr>
+            <w:tcW w:type="dxa" w:w="850"/>
+            <w:tcBorders>
+              <w:top w:val="single" w:color="AAAAAA" w:sz="1"/>
+              <w:left w:val="single" w:color="AAAAAA" w:sz="1"/>
+              <w:bottom w:val="single" w:color="AAAAAA" w:sz="1"/>
+              <w:right w:val="single" w:color="AAAAAA" w:sz="1"/>
+            </w:tcBorders>
+            <w:tcMar>
+              <w:top w:type="dxa" w:w="70"/>
+              <w:left w:type="dxa" w:w="100"/>
+              <w:bottom w:type="dxa" w:w="70"/>
+              <w:right w:type="dxa" w:w="100"/>
+            </w:tcMar>
+          </w:tcPr>
+          <w:p>
+            <w:pPr>
+              <w:jc w:val="center"/>
+            </w:pPr>
+            <w:r>
+              <w:rPr>
+                <w:rFonts w:ascii="Arial" w:cs="Arial" w:eastAsia="Arial" w:hAnsi="Arial"/>
+                <w:sz w:val="20"/>
+                <w:szCs w:val="20"/>
+              </w:rPr>
+              <w:t xml:space="preserve">0.426 ± 0.080</w:t>
             </w:r>
           </w:p>
         </w:tc>
@@ -2176,7 +2541,7 @@
       <w:tr>
         <w:tc>
           <w:tcPr>
-            <w:tcW w:type="dxa" w:w="2300"/>
+            <w:tcW w:type="dxa" w:w="1700"/>
             <w:tcBorders>
               <w:top w:val="single" w:color="AAAAAA" w:sz="1"/>
               <w:left w:val="single" w:color="AAAAAA" w:sz="1"/>
@@ -2206,7 +2571,7 @@
         </w:tc>
         <w:tc>
           <w:tcPr>
-            <w:tcW w:type="dxa" w:w="1100"/>
+            <w:tcW w:type="dxa" w:w="800"/>
             <w:tcBorders>
               <w:top w:val="single" w:color="AAAAAA" w:sz="1"/>
               <w:left w:val="single" w:color="AAAAAA" w:sz="1"/>
@@ -2236,7 +2601,7 @@
         </w:tc>
         <w:tc>
           <w:tcPr>
-            <w:tcW w:type="dxa" w:w="1800"/>
+            <w:tcW w:type="dxa" w:w="1500"/>
             <w:tcBorders>
               <w:top w:val="single" w:color="AAAAAA" w:sz="1"/>
               <w:left w:val="single" w:color="AAAAAA" w:sz="1"/>
@@ -2266,7 +2631,7 @@
         </w:tc>
         <w:tc>
           <w:tcPr>
-            <w:tcW w:type="dxa" w:w="1300"/>
+            <w:tcW w:type="dxa" w:w="1500"/>
             <w:tcBorders>
               <w:top w:val="single" w:color="AAAAAA" w:sz="1"/>
               <w:left w:val="single" w:color="AAAAAA" w:sz="1"/>
@@ -2296,7 +2661,7 @@
         </w:tc>
         <w:tc>
           <w:tcPr>
-            <w:tcW w:type="dxa" w:w="1300"/>
+            <w:tcW w:type="dxa" w:w="1200"/>
             <w:tcBorders>
               <w:top w:val="single" w:color="AAAAAA" w:sz="1"/>
               <w:left w:val="single" w:color="AAAAAA" w:sz="1"/>
@@ -2326,61 +2691,151 @@
         </w:tc>
         <w:tc>
           <w:tcPr>
-            <w:tcW w:type="dxa" w:w="800"/>
-            <w:tcBorders>
-              <w:top w:val="single" w:color="AAAAAA" w:sz="1"/>
-              <w:left w:val="single" w:color="AAAAAA" w:sz="1"/>
-              <w:bottom w:val="single" w:color="AAAAAA" w:sz="1"/>
-              <w:right w:val="single" w:color="AAAAAA" w:sz="1"/>
-            </w:tcBorders>
-            <w:tcMar>
-              <w:top w:type="dxa" w:w="70"/>
-              <w:left w:type="dxa" w:w="100"/>
-              <w:bottom w:type="dxa" w:w="70"/>
-              <w:right w:type="dxa" w:w="100"/>
-            </w:tcMar>
-          </w:tcPr>
-          <w:p>
-            <w:pPr>
-              <w:jc w:val="center"/>
-            </w:pPr>
-            <w:r>
-              <w:rPr>
-                <w:rFonts w:ascii="Arial" w:cs="Arial" w:eastAsia="Arial" w:hAnsi="Arial"/>
-                <w:sz w:val="20"/>
-                <w:szCs w:val="20"/>
-              </w:rPr>
-              <w:t xml:space="preserve">0.043</w:t>
-            </w:r>
-          </w:p>
-        </w:tc>
-        <w:tc>
-          <w:tcPr>
-            <w:tcW w:type="dxa" w:w="800"/>
-            <w:tcBorders>
-              <w:top w:val="single" w:color="AAAAAA" w:sz="1"/>
-              <w:left w:val="single" w:color="AAAAAA" w:sz="1"/>
-              <w:bottom w:val="single" w:color="AAAAAA" w:sz="1"/>
-              <w:right w:val="single" w:color="AAAAAA" w:sz="1"/>
-            </w:tcBorders>
-            <w:tcMar>
-              <w:top w:type="dxa" w:w="70"/>
-              <w:left w:type="dxa" w:w="100"/>
-              <w:bottom w:type="dxa" w:w="70"/>
-              <w:right w:type="dxa" w:w="100"/>
-            </w:tcMar>
-          </w:tcPr>
-          <w:p>
-            <w:pPr>
-              <w:jc w:val="center"/>
-            </w:pPr>
-            <w:r>
-              <w:rPr>
-                <w:rFonts w:ascii="Arial" w:cs="Arial" w:eastAsia="Arial" w:hAnsi="Arial"/>
-                <w:sz w:val="20"/>
-                <w:szCs w:val="20"/>
-              </w:rPr>
-              <w:t xml:space="preserve">0.160</w:t>
+            <w:tcW w:type="dxa" w:w="850"/>
+            <w:tcBorders>
+              <w:top w:val="single" w:color="AAAAAA" w:sz="1"/>
+              <w:left w:val="single" w:color="AAAAAA" w:sz="1"/>
+              <w:bottom w:val="single" w:color="AAAAAA" w:sz="1"/>
+              <w:right w:val="single" w:color="AAAAAA" w:sz="1"/>
+            </w:tcBorders>
+            <w:tcMar>
+              <w:top w:type="dxa" w:w="70"/>
+              <w:left w:type="dxa" w:w="100"/>
+              <w:bottom w:type="dxa" w:w="70"/>
+              <w:right w:type="dxa" w:w="100"/>
+            </w:tcMar>
+          </w:tcPr>
+          <w:p>
+            <w:pPr>
+              <w:jc w:val="center"/>
+            </w:pPr>
+            <w:r>
+              <w:rPr>
+                <w:rFonts w:ascii="Arial" w:cs="Arial" w:eastAsia="Arial" w:hAnsi="Arial"/>
+                <w:sz w:val="20"/>
+                <w:szCs w:val="20"/>
+              </w:rPr>
+              <w:t xml:space="preserve">0.950 ± 0.010</w:t>
+            </w:r>
+          </w:p>
+        </w:tc>
+        <w:tc>
+          <w:tcPr>
+            <w:tcW w:type="dxa" w:w="850"/>
+            <w:tcBorders>
+              <w:top w:val="single" w:color="AAAAAA" w:sz="1"/>
+              <w:left w:val="single" w:color="AAAAAA" w:sz="1"/>
+              <w:bottom w:val="single" w:color="AAAAAA" w:sz="1"/>
+              <w:right w:val="single" w:color="AAAAAA" w:sz="1"/>
+            </w:tcBorders>
+            <w:tcMar>
+              <w:top w:type="dxa" w:w="70"/>
+              <w:left w:type="dxa" w:w="100"/>
+              <w:bottom w:type="dxa" w:w="70"/>
+              <w:right w:type="dxa" w:w="100"/>
+            </w:tcMar>
+          </w:tcPr>
+          <w:p>
+            <w:pPr>
+              <w:jc w:val="center"/>
+            </w:pPr>
+            <w:r>
+              <w:rPr>
+                <w:rFonts w:ascii="Arial" w:cs="Arial" w:eastAsia="Arial" w:hAnsi="Arial"/>
+                <w:sz w:val="20"/>
+                <w:szCs w:val="20"/>
+              </w:rPr>
+              <w:t xml:space="preserve">0.043 ± 0.073</w:t>
+            </w:r>
+          </w:p>
+        </w:tc>
+        <w:tc>
+          <w:tcPr>
+            <w:tcW w:type="dxa" w:w="850"/>
+            <w:tcBorders>
+              <w:top w:val="single" w:color="AAAAAA" w:sz="1"/>
+              <w:left w:val="single" w:color="AAAAAA" w:sz="1"/>
+              <w:bottom w:val="single" w:color="AAAAAA" w:sz="1"/>
+              <w:right w:val="single" w:color="AAAAAA" w:sz="1"/>
+            </w:tcBorders>
+            <w:tcMar>
+              <w:top w:type="dxa" w:w="70"/>
+              <w:left w:type="dxa" w:w="100"/>
+              <w:bottom w:type="dxa" w:w="70"/>
+              <w:right w:type="dxa" w:w="100"/>
+            </w:tcMar>
+          </w:tcPr>
+          <w:p>
+            <w:pPr>
+              <w:jc w:val="center"/>
+            </w:pPr>
+            <w:r>
+              <w:rPr>
+                <w:rFonts w:ascii="Arial" w:cs="Arial" w:eastAsia="Arial" w:hAnsi="Arial"/>
+                <w:sz w:val="20"/>
+                <w:szCs w:val="20"/>
+              </w:rPr>
+              <w:t xml:space="preserve">0.601 ± 0.299</w:t>
+            </w:r>
+          </w:p>
+        </w:tc>
+        <w:tc>
+          <w:tcPr>
+            <w:tcW w:type="dxa" w:w="850"/>
+            <w:tcBorders>
+              <w:top w:val="single" w:color="AAAAAA" w:sz="1"/>
+              <w:left w:val="single" w:color="AAAAAA" w:sz="1"/>
+              <w:bottom w:val="single" w:color="AAAAAA" w:sz="1"/>
+              <w:right w:val="single" w:color="AAAAAA" w:sz="1"/>
+            </w:tcBorders>
+            <w:tcMar>
+              <w:top w:type="dxa" w:w="70"/>
+              <w:left w:type="dxa" w:w="100"/>
+              <w:bottom w:type="dxa" w:w="70"/>
+              <w:right w:type="dxa" w:w="100"/>
+            </w:tcMar>
+          </w:tcPr>
+          <w:p>
+            <w:pPr>
+              <w:jc w:val="center"/>
+            </w:pPr>
+            <w:r>
+              <w:rPr>
+                <w:rFonts w:ascii="Arial" w:cs="Arial" w:eastAsia="Arial" w:hAnsi="Arial"/>
+                <w:sz w:val="20"/>
+                <w:szCs w:val="20"/>
+              </w:rPr>
+              <w:t xml:space="preserve">0.160 ± 0.251</w:t>
+            </w:r>
+          </w:p>
+        </w:tc>
+        <w:tc>
+          <w:tcPr>
+            <w:tcW w:type="dxa" w:w="850"/>
+            <w:tcBorders>
+              <w:top w:val="single" w:color="AAAAAA" w:sz="1"/>
+              <w:left w:val="single" w:color="AAAAAA" w:sz="1"/>
+              <w:bottom w:val="single" w:color="AAAAAA" w:sz="1"/>
+              <w:right w:val="single" w:color="AAAAAA" w:sz="1"/>
+            </w:tcBorders>
+            <w:tcMar>
+              <w:top w:type="dxa" w:w="70"/>
+              <w:left w:type="dxa" w:w="100"/>
+              <w:bottom w:type="dxa" w:w="70"/>
+              <w:right w:type="dxa" w:w="100"/>
+            </w:tcMar>
+          </w:tcPr>
+          <w:p>
+            <w:pPr>
+              <w:jc w:val="center"/>
+            </w:pPr>
+            <w:r>
+              <w:rPr>
+                <w:rFonts w:ascii="Arial" w:cs="Arial" w:eastAsia="Arial" w:hAnsi="Arial"/>
+                <w:sz w:val="20"/>
+                <w:szCs w:val="20"/>
+              </w:rPr>
+              <w:t xml:space="preserve">0.083 ± 0.136</w:t>
             </w:r>
           </w:p>
         </w:tc>
@@ -2388,7 +2843,7 @@
       <w:tr>
         <w:tc>
           <w:tcPr>
-            <w:tcW w:type="dxa" w:w="2300"/>
+            <w:tcW w:type="dxa" w:w="1700"/>
             <w:tcBorders>
               <w:top w:val="single" w:color="AAAAAA" w:sz="1"/>
               <w:left w:val="single" w:color="AAAAAA" w:sz="1"/>
@@ -2418,7 +2873,7 @@
         </w:tc>
         <w:tc>
           <w:tcPr>
-            <w:tcW w:type="dxa" w:w="1100"/>
+            <w:tcW w:type="dxa" w:w="800"/>
             <w:tcBorders>
               <w:top w:val="single" w:color="AAAAAA" w:sz="1"/>
               <w:left w:val="single" w:color="AAAAAA" w:sz="1"/>
@@ -2448,7 +2903,7 @@
         </w:tc>
         <w:tc>
           <w:tcPr>
-            <w:tcW w:type="dxa" w:w="1800"/>
+            <w:tcW w:type="dxa" w:w="1500"/>
             <w:tcBorders>
               <w:top w:val="single" w:color="AAAAAA" w:sz="1"/>
               <w:left w:val="single" w:color="AAAAAA" w:sz="1"/>
@@ -2478,7 +2933,7 @@
         </w:tc>
         <w:tc>
           <w:tcPr>
-            <w:tcW w:type="dxa" w:w="1300"/>
+            <w:tcW w:type="dxa" w:w="1500"/>
             <w:tcBorders>
               <w:top w:val="single" w:color="AAAAAA" w:sz="1"/>
               <w:left w:val="single" w:color="AAAAAA" w:sz="1"/>
@@ -2508,7 +2963,7 @@
         </w:tc>
         <w:tc>
           <w:tcPr>
-            <w:tcW w:type="dxa" w:w="1300"/>
+            <w:tcW w:type="dxa" w:w="1200"/>
             <w:tcBorders>
               <w:top w:val="single" w:color="AAAAAA" w:sz="1"/>
               <w:left w:val="single" w:color="AAAAAA" w:sz="1"/>
@@ -2538,61 +2993,151 @@
         </w:tc>
         <w:tc>
           <w:tcPr>
-            <w:tcW w:type="dxa" w:w="800"/>
-            <w:tcBorders>
-              <w:top w:val="single" w:color="AAAAAA" w:sz="1"/>
-              <w:left w:val="single" w:color="AAAAAA" w:sz="1"/>
-              <w:bottom w:val="single" w:color="AAAAAA" w:sz="1"/>
-              <w:right w:val="single" w:color="AAAAAA" w:sz="1"/>
-            </w:tcBorders>
-            <w:tcMar>
-              <w:top w:type="dxa" w:w="70"/>
-              <w:left w:type="dxa" w:w="100"/>
-              <w:bottom w:type="dxa" w:w="70"/>
-              <w:right w:type="dxa" w:w="100"/>
-            </w:tcMar>
-          </w:tcPr>
-          <w:p>
-            <w:pPr>
-              <w:jc w:val="center"/>
-            </w:pPr>
-            <w:r>
-              <w:rPr>
-                <w:rFonts w:ascii="Arial" w:cs="Arial" w:eastAsia="Arial" w:hAnsi="Arial"/>
-                <w:sz w:val="20"/>
-                <w:szCs w:val="20"/>
-              </w:rPr>
-              <w:t xml:space="preserve">0.318</w:t>
-            </w:r>
-          </w:p>
-        </w:tc>
-        <w:tc>
-          <w:tcPr>
-            <w:tcW w:type="dxa" w:w="800"/>
-            <w:tcBorders>
-              <w:top w:val="single" w:color="AAAAAA" w:sz="1"/>
-              <w:left w:val="single" w:color="AAAAAA" w:sz="1"/>
-              <w:bottom w:val="single" w:color="AAAAAA" w:sz="1"/>
-              <w:right w:val="single" w:color="AAAAAA" w:sz="1"/>
-            </w:tcBorders>
-            <w:tcMar>
-              <w:top w:type="dxa" w:w="70"/>
-              <w:left w:type="dxa" w:w="100"/>
-              <w:bottom w:type="dxa" w:w="70"/>
-              <w:right w:type="dxa" w:w="100"/>
-            </w:tcMar>
-          </w:tcPr>
-          <w:p>
-            <w:pPr>
-              <w:jc w:val="center"/>
-            </w:pPr>
-            <w:r>
-              <w:rPr>
-                <w:rFonts w:ascii="Arial" w:cs="Arial" w:eastAsia="Arial" w:hAnsi="Arial"/>
-                <w:sz w:val="20"/>
-                <w:szCs w:val="20"/>
-              </w:rPr>
-              <w:t xml:space="preserve">0.772</w:t>
+            <w:tcW w:type="dxa" w:w="850"/>
+            <w:tcBorders>
+              <w:top w:val="single" w:color="AAAAAA" w:sz="1"/>
+              <w:left w:val="single" w:color="AAAAAA" w:sz="1"/>
+              <w:bottom w:val="single" w:color="AAAAAA" w:sz="1"/>
+              <w:right w:val="single" w:color="AAAAAA" w:sz="1"/>
+            </w:tcBorders>
+            <w:tcMar>
+              <w:top w:type="dxa" w:w="70"/>
+              <w:left w:type="dxa" w:w="100"/>
+              <w:bottom w:type="dxa" w:w="70"/>
+              <w:right w:type="dxa" w:w="100"/>
+            </w:tcMar>
+          </w:tcPr>
+          <w:p>
+            <w:pPr>
+              <w:jc w:val="center"/>
+            </w:pPr>
+            <w:r>
+              <w:rPr>
+                <w:rFonts w:ascii="Arial" w:cs="Arial" w:eastAsia="Arial" w:hAnsi="Arial"/>
+                <w:sz w:val="20"/>
+                <w:szCs w:val="20"/>
+              </w:rPr>
+              <w:t xml:space="preserve">0.977 ± 0.004</w:t>
+            </w:r>
+          </w:p>
+        </w:tc>
+        <w:tc>
+          <w:tcPr>
+            <w:tcW w:type="dxa" w:w="850"/>
+            <w:tcBorders>
+              <w:top w:val="single" w:color="AAAAAA" w:sz="1"/>
+              <w:left w:val="single" w:color="AAAAAA" w:sz="1"/>
+              <w:bottom w:val="single" w:color="AAAAAA" w:sz="1"/>
+              <w:right w:val="single" w:color="AAAAAA" w:sz="1"/>
+            </w:tcBorders>
+            <w:tcMar>
+              <w:top w:type="dxa" w:w="70"/>
+              <w:left w:type="dxa" w:w="100"/>
+              <w:bottom w:type="dxa" w:w="70"/>
+              <w:right w:type="dxa" w:w="100"/>
+            </w:tcMar>
+          </w:tcPr>
+          <w:p>
+            <w:pPr>
+              <w:jc w:val="center"/>
+            </w:pPr>
+            <w:r>
+              <w:rPr>
+                <w:rFonts w:ascii="Arial" w:cs="Arial" w:eastAsia="Arial" w:hAnsi="Arial"/>
+                <w:sz w:val="20"/>
+                <w:szCs w:val="20"/>
+              </w:rPr>
+              <w:t xml:space="preserve">0.318 ± 0.030</w:t>
+            </w:r>
+          </w:p>
+        </w:tc>
+        <w:tc>
+          <w:tcPr>
+            <w:tcW w:type="dxa" w:w="850"/>
+            <w:tcBorders>
+              <w:top w:val="single" w:color="AAAAAA" w:sz="1"/>
+              <w:left w:val="single" w:color="AAAAAA" w:sz="1"/>
+              <w:bottom w:val="single" w:color="AAAAAA" w:sz="1"/>
+              <w:right w:val="single" w:color="AAAAAA" w:sz="1"/>
+            </w:tcBorders>
+            <w:tcMar>
+              <w:top w:type="dxa" w:w="70"/>
+              <w:left w:type="dxa" w:w="100"/>
+              <w:bottom w:type="dxa" w:w="70"/>
+              <w:right w:type="dxa" w:w="100"/>
+            </w:tcMar>
+          </w:tcPr>
+          <w:p>
+            <w:pPr>
+              <w:jc w:val="center"/>
+            </w:pPr>
+            <w:r>
+              <w:rPr>
+                <w:rFonts w:ascii="Arial" w:cs="Arial" w:eastAsia="Arial" w:hAnsi="Arial"/>
+                <w:sz w:val="20"/>
+                <w:szCs w:val="20"/>
+              </w:rPr>
+              <w:t xml:space="preserve">0.833 ± 0.031</w:t>
+            </w:r>
+          </w:p>
+        </w:tc>
+        <w:tc>
+          <w:tcPr>
+            <w:tcW w:type="dxa" w:w="850"/>
+            <w:tcBorders>
+              <w:top w:val="single" w:color="AAAAAA" w:sz="1"/>
+              <w:left w:val="single" w:color="AAAAAA" w:sz="1"/>
+              <w:bottom w:val="single" w:color="AAAAAA" w:sz="1"/>
+              <w:right w:val="single" w:color="AAAAAA" w:sz="1"/>
+            </w:tcBorders>
+            <w:tcMar>
+              <w:top w:type="dxa" w:w="70"/>
+              <w:left w:type="dxa" w:w="100"/>
+              <w:bottom w:type="dxa" w:w="70"/>
+              <w:right w:type="dxa" w:w="100"/>
+            </w:tcMar>
+          </w:tcPr>
+          <w:p>
+            <w:pPr>
+              <w:jc w:val="center"/>
+            </w:pPr>
+            <w:r>
+              <w:rPr>
+                <w:rFonts w:ascii="Arial" w:cs="Arial" w:eastAsia="Arial" w:hAnsi="Arial"/>
+                <w:sz w:val="20"/>
+                <w:szCs w:val="20"/>
+              </w:rPr>
+              <w:t xml:space="preserve">0.772 ± 0.052</w:t>
+            </w:r>
+          </w:p>
+        </w:tc>
+        <w:tc>
+          <w:tcPr>
+            <w:tcW w:type="dxa" w:w="850"/>
+            <w:tcBorders>
+              <w:top w:val="single" w:color="AAAAAA" w:sz="1"/>
+              <w:left w:val="single" w:color="AAAAAA" w:sz="1"/>
+              <w:bottom w:val="single" w:color="AAAAAA" w:sz="1"/>
+              <w:right w:val="single" w:color="AAAAAA" w:sz="1"/>
+            </w:tcBorders>
+            <w:tcMar>
+              <w:top w:type="dxa" w:w="70"/>
+              <w:left w:type="dxa" w:w="100"/>
+              <w:bottom w:type="dxa" w:w="70"/>
+              <w:right w:type="dxa" w:w="100"/>
+            </w:tcMar>
+          </w:tcPr>
+          <w:p>
+            <w:pPr>
+              <w:jc w:val="center"/>
+            </w:pPr>
+            <w:r>
+              <w:rPr>
+                <w:rFonts w:ascii="Arial" w:cs="Arial" w:eastAsia="Arial" w:hAnsi="Arial"/>
+                <w:sz w:val="20"/>
+                <w:szCs w:val="20"/>
+              </w:rPr>
+              <w:t xml:space="preserve">0.668 ± 0.060</w:t>
             </w:r>
           </w:p>
         </w:tc>
@@ -2600,7 +3145,7 @@
       <w:tr>
         <w:tc>
           <w:tcPr>
-            <w:tcW w:type="dxa" w:w="2300"/>
+            <w:tcW w:type="dxa" w:w="1700"/>
             <w:tcBorders>
               <w:top w:val="single" w:color="AAAAAA" w:sz="1"/>
               <w:left w:val="single" w:color="AAAAAA" w:sz="1"/>
@@ -2630,7 +3175,7 @@
         </w:tc>
         <w:tc>
           <w:tcPr>
-            <w:tcW w:type="dxa" w:w="1100"/>
+            <w:tcW w:type="dxa" w:w="800"/>
             <w:tcBorders>
               <w:top w:val="single" w:color="AAAAAA" w:sz="1"/>
               <w:left w:val="single" w:color="AAAAAA" w:sz="1"/>
@@ -2660,7 +3205,7 @@
         </w:tc>
         <w:tc>
           <w:tcPr>
-            <w:tcW w:type="dxa" w:w="1800"/>
+            <w:tcW w:type="dxa" w:w="1500"/>
             <w:tcBorders>
               <w:top w:val="single" w:color="AAAAAA" w:sz="1"/>
               <w:left w:val="single" w:color="AAAAAA" w:sz="1"/>
@@ -2690,7 +3235,7 @@
         </w:tc>
         <w:tc>
           <w:tcPr>
-            <w:tcW w:type="dxa" w:w="1300"/>
+            <w:tcW w:type="dxa" w:w="1500"/>
             <w:tcBorders>
               <w:top w:val="single" w:color="AAAAAA" w:sz="1"/>
               <w:left w:val="single" w:color="AAAAAA" w:sz="1"/>
@@ -2720,7 +3265,7 @@
         </w:tc>
         <w:tc>
           <w:tcPr>
-            <w:tcW w:type="dxa" w:w="1300"/>
+            <w:tcW w:type="dxa" w:w="1200"/>
             <w:tcBorders>
               <w:top w:val="single" w:color="AAAAAA" w:sz="1"/>
               <w:left w:val="single" w:color="AAAAAA" w:sz="1"/>
@@ -2750,61 +3295,151 @@
         </w:tc>
         <w:tc>
           <w:tcPr>
-            <w:tcW w:type="dxa" w:w="800"/>
-            <w:tcBorders>
-              <w:top w:val="single" w:color="AAAAAA" w:sz="1"/>
-              <w:left w:val="single" w:color="AAAAAA" w:sz="1"/>
-              <w:bottom w:val="single" w:color="AAAAAA" w:sz="1"/>
-              <w:right w:val="single" w:color="AAAAAA" w:sz="1"/>
-            </w:tcBorders>
-            <w:tcMar>
-              <w:top w:type="dxa" w:w="70"/>
-              <w:left w:type="dxa" w:w="100"/>
-              <w:bottom w:type="dxa" w:w="70"/>
-              <w:right w:type="dxa" w:w="100"/>
-            </w:tcMar>
-          </w:tcPr>
-          <w:p>
-            <w:pPr>
-              <w:jc w:val="center"/>
-            </w:pPr>
-            <w:r>
-              <w:rPr>
-                <w:rFonts w:ascii="Arial" w:cs="Arial" w:eastAsia="Arial" w:hAnsi="Arial"/>
-                <w:sz w:val="20"/>
-                <w:szCs w:val="20"/>
-              </w:rPr>
-              <w:t xml:space="preserve">0.139</w:t>
-            </w:r>
-          </w:p>
-        </w:tc>
-        <w:tc>
-          <w:tcPr>
-            <w:tcW w:type="dxa" w:w="800"/>
-            <w:tcBorders>
-              <w:top w:val="single" w:color="AAAAAA" w:sz="1"/>
-              <w:left w:val="single" w:color="AAAAAA" w:sz="1"/>
-              <w:bottom w:val="single" w:color="AAAAAA" w:sz="1"/>
-              <w:right w:val="single" w:color="AAAAAA" w:sz="1"/>
-            </w:tcBorders>
-            <w:tcMar>
-              <w:top w:type="dxa" w:w="70"/>
-              <w:left w:type="dxa" w:w="100"/>
-              <w:bottom w:type="dxa" w:w="70"/>
-              <w:right w:type="dxa" w:w="100"/>
-            </w:tcMar>
-          </w:tcPr>
-          <w:p>
-            <w:pPr>
-              <w:jc w:val="center"/>
-            </w:pPr>
-            <w:r>
-              <w:rPr>
-                <w:rFonts w:ascii="Arial" w:cs="Arial" w:eastAsia="Arial" w:hAnsi="Arial"/>
-                <w:sz w:val="20"/>
-                <w:szCs w:val="20"/>
-              </w:rPr>
-              <w:t xml:space="preserve">0.592</w:t>
+            <w:tcW w:type="dxa" w:w="850"/>
+            <w:tcBorders>
+              <w:top w:val="single" w:color="AAAAAA" w:sz="1"/>
+              <w:left w:val="single" w:color="AAAAAA" w:sz="1"/>
+              <w:bottom w:val="single" w:color="AAAAAA" w:sz="1"/>
+              <w:right w:val="single" w:color="AAAAAA" w:sz="1"/>
+            </w:tcBorders>
+            <w:tcMar>
+              <w:top w:type="dxa" w:w="70"/>
+              <w:left w:type="dxa" w:w="100"/>
+              <w:bottom w:type="dxa" w:w="70"/>
+              <w:right w:type="dxa" w:w="100"/>
+            </w:tcMar>
+          </w:tcPr>
+          <w:p>
+            <w:pPr>
+              <w:jc w:val="center"/>
+            </w:pPr>
+            <w:r>
+              <w:rPr>
+                <w:rFonts w:ascii="Arial" w:cs="Arial" w:eastAsia="Arial" w:hAnsi="Arial"/>
+                <w:sz w:val="20"/>
+                <w:szCs w:val="20"/>
+              </w:rPr>
+              <w:t xml:space="preserve">0.911 ± 0.007</w:t>
+            </w:r>
+          </w:p>
+        </w:tc>
+        <w:tc>
+          <w:tcPr>
+            <w:tcW w:type="dxa" w:w="850"/>
+            <w:tcBorders>
+              <w:top w:val="single" w:color="AAAAAA" w:sz="1"/>
+              <w:left w:val="single" w:color="AAAAAA" w:sz="1"/>
+              <w:bottom w:val="single" w:color="AAAAAA" w:sz="1"/>
+              <w:right w:val="single" w:color="AAAAAA" w:sz="1"/>
+            </w:tcBorders>
+            <w:tcMar>
+              <w:top w:type="dxa" w:w="70"/>
+              <w:left w:type="dxa" w:w="100"/>
+              <w:bottom w:type="dxa" w:w="70"/>
+              <w:right w:type="dxa" w:w="100"/>
+            </w:tcMar>
+          </w:tcPr>
+          <w:p>
+            <w:pPr>
+              <w:jc w:val="center"/>
+            </w:pPr>
+            <w:r>
+              <w:rPr>
+                <w:rFonts w:ascii="Arial" w:cs="Arial" w:eastAsia="Arial" w:hAnsi="Arial"/>
+                <w:sz w:val="20"/>
+                <w:szCs w:val="20"/>
+              </w:rPr>
+              <w:t xml:space="preserve">0.139 ± 0.016</w:t>
+            </w:r>
+          </w:p>
+        </w:tc>
+        <w:tc>
+          <w:tcPr>
+            <w:tcW w:type="dxa" w:w="850"/>
+            <w:tcBorders>
+              <w:top w:val="single" w:color="AAAAAA" w:sz="1"/>
+              <w:left w:val="single" w:color="AAAAAA" w:sz="1"/>
+              <w:bottom w:val="single" w:color="AAAAAA" w:sz="1"/>
+              <w:right w:val="single" w:color="AAAAAA" w:sz="1"/>
+            </w:tcBorders>
+            <w:tcMar>
+              <w:top w:type="dxa" w:w="70"/>
+              <w:left w:type="dxa" w:w="100"/>
+              <w:bottom w:type="dxa" w:w="70"/>
+              <w:right w:type="dxa" w:w="100"/>
+            </w:tcMar>
+          </w:tcPr>
+          <w:p>
+            <w:pPr>
+              <w:jc w:val="center"/>
+            </w:pPr>
+            <w:r>
+              <w:rPr>
+                <w:rFonts w:ascii="Arial" w:cs="Arial" w:eastAsia="Arial" w:hAnsi="Arial"/>
+                <w:sz w:val="20"/>
+                <w:szCs w:val="20"/>
+              </w:rPr>
+              <w:t xml:space="preserve">0.672 ± 0.023</w:t>
+            </w:r>
+          </w:p>
+        </w:tc>
+        <w:tc>
+          <w:tcPr>
+            <w:tcW w:type="dxa" w:w="850"/>
+            <w:tcBorders>
+              <w:top w:val="single" w:color="AAAAAA" w:sz="1"/>
+              <w:left w:val="single" w:color="AAAAAA" w:sz="1"/>
+              <w:bottom w:val="single" w:color="AAAAAA" w:sz="1"/>
+              <w:right w:val="single" w:color="AAAAAA" w:sz="1"/>
+            </w:tcBorders>
+            <w:tcMar>
+              <w:top w:type="dxa" w:w="70"/>
+              <w:left w:type="dxa" w:w="100"/>
+              <w:bottom w:type="dxa" w:w="70"/>
+              <w:right w:type="dxa" w:w="100"/>
+            </w:tcMar>
+          </w:tcPr>
+          <w:p>
+            <w:pPr>
+              <w:jc w:val="center"/>
+            </w:pPr>
+            <w:r>
+              <w:rPr>
+                <w:rFonts w:ascii="Arial" w:cs="Arial" w:eastAsia="Arial" w:hAnsi="Arial"/>
+                <w:sz w:val="20"/>
+                <w:szCs w:val="20"/>
+              </w:rPr>
+              <w:t xml:space="preserve">0.592 ± 0.124</w:t>
+            </w:r>
+          </w:p>
+        </w:tc>
+        <w:tc>
+          <w:tcPr>
+            <w:tcW w:type="dxa" w:w="850"/>
+            <w:tcBorders>
+              <w:top w:val="single" w:color="AAAAAA" w:sz="1"/>
+              <w:left w:val="single" w:color="AAAAAA" w:sz="1"/>
+              <w:bottom w:val="single" w:color="AAAAAA" w:sz="1"/>
+              <w:right w:val="single" w:color="AAAAAA" w:sz="1"/>
+            </w:tcBorders>
+            <w:tcMar>
+              <w:top w:type="dxa" w:w="70"/>
+              <w:left w:type="dxa" w:w="100"/>
+              <w:bottom w:type="dxa" w:w="70"/>
+              <w:right w:type="dxa" w:w="100"/>
+            </w:tcMar>
+          </w:tcPr>
+          <w:p>
+            <w:pPr>
+              <w:jc w:val="center"/>
+            </w:pPr>
+            <w:r>
+              <w:rPr>
+                <w:rFonts w:ascii="Arial" w:cs="Arial" w:eastAsia="Arial" w:hAnsi="Arial"/>
+                <w:sz w:val="20"/>
+                <w:szCs w:val="20"/>
+              </w:rPr>
+              <w:t xml:space="preserve">0.516 ± 0.056</w:t>
             </w:r>
           </w:p>
         </w:tc>
@@ -2812,7 +3447,7 @@
       <w:tr>
         <w:tc>
           <w:tcPr>
-            <w:tcW w:type="dxa" w:w="2300"/>
+            <w:tcW w:type="dxa" w:w="1700"/>
             <w:tcBorders>
               <w:top w:val="single" w:color="AAAAAA" w:sz="1"/>
               <w:left w:val="single" w:color="AAAAAA" w:sz="1"/>
@@ -2843,7 +3478,7 @@
         </w:tc>
         <w:tc>
           <w:tcPr>
-            <w:tcW w:type="dxa" w:w="1100"/>
+            <w:tcW w:type="dxa" w:w="800"/>
             <w:tcBorders>
               <w:top w:val="single" w:color="AAAAAA" w:sz="1"/>
               <w:left w:val="single" w:color="AAAAAA" w:sz="1"/>
@@ -2868,13 +3503,13 @@
                 <w:sz w:val="20"/>
                 <w:szCs w:val="20"/>
               </w:rPr>
-              <w:t xml:space="preserve">**0.66M**</w:t>
-            </w:r>
-          </w:p>
-        </w:tc>
-        <w:tc>
-          <w:tcPr>
-            <w:tcW w:type="dxa" w:w="1800"/>
+              <w:t xml:space="preserve">0.66M</w:t>
+            </w:r>
+          </w:p>
+        </w:tc>
+        <w:tc>
+          <w:tcPr>
+            <w:tcW w:type="dxa" w:w="1500"/>
             <w:tcBorders>
               <w:top w:val="single" w:color="AAAAAA" w:sz="1"/>
               <w:left w:val="single" w:color="AAAAAA" w:sz="1"/>
@@ -2905,7 +3540,7 @@
         </w:tc>
         <w:tc>
           <w:tcPr>
-            <w:tcW w:type="dxa" w:w="1300"/>
+            <w:tcW w:type="dxa" w:w="1500"/>
             <w:tcBorders>
               <w:top w:val="single" w:color="AAAAAA" w:sz="1"/>
               <w:left w:val="single" w:color="AAAAAA" w:sz="1"/>
@@ -2936,7 +3571,7 @@
         </w:tc>
         <w:tc>
           <w:tcPr>
-            <w:tcW w:type="dxa" w:w="1300"/>
+            <w:tcW w:type="dxa" w:w="1200"/>
             <w:tcBorders>
               <w:top w:val="single" w:color="AAAAAA" w:sz="1"/>
               <w:left w:val="single" w:color="AAAAAA" w:sz="1"/>
@@ -2967,7 +3602,7 @@
         </w:tc>
         <w:tc>
           <w:tcPr>
-            <w:tcW w:type="dxa" w:w="800"/>
+            <w:tcW w:type="dxa" w:w="850"/>
             <w:tcBorders>
               <w:top w:val="single" w:color="AAAAAA" w:sz="1"/>
               <w:left w:val="single" w:color="AAAAAA" w:sz="1"/>
@@ -2992,13 +3627,13 @@
                 <w:sz w:val="20"/>
                 <w:szCs w:val="20"/>
               </w:rPr>
-              <w:t xml:space="preserve">0.339</w:t>
-            </w:r>
-          </w:p>
-        </w:tc>
-        <w:tc>
-          <w:tcPr>
-            <w:tcW w:type="dxa" w:w="800"/>
+              <w:t xml:space="preserve">0.975 ± 0.012</w:t>
+            </w:r>
+          </w:p>
+        </w:tc>
+        <w:tc>
+          <w:tcPr>
+            <w:tcW w:type="dxa" w:w="850"/>
             <w:tcBorders>
               <w:top w:val="single" w:color="AAAAAA" w:sz="1"/>
               <w:left w:val="single" w:color="AAAAAA" w:sz="1"/>
@@ -3023,7 +3658,100 @@
                 <w:sz w:val="20"/>
                 <w:szCs w:val="20"/>
               </w:rPr>
-              <w:t xml:space="preserve">0.759</w:t>
+              <w:t xml:space="preserve">0.339 ± 0.053</w:t>
+            </w:r>
+          </w:p>
+        </w:tc>
+        <w:tc>
+          <w:tcPr>
+            <w:tcW w:type="dxa" w:w="850"/>
+            <w:tcBorders>
+              <w:top w:val="single" w:color="AAAAAA" w:sz="1"/>
+              <w:left w:val="single" w:color="AAAAAA" w:sz="1"/>
+              <w:bottom w:val="single" w:color="AAAAAA" w:sz="1"/>
+              <w:right w:val="single" w:color="AAAAAA" w:sz="1"/>
+            </w:tcBorders>
+            <w:shd w:fill="FFF2CC" w:val="clear"/>
+            <w:tcMar>
+              <w:top w:type="dxa" w:w="70"/>
+              <w:left w:type="dxa" w:w="100"/>
+              <w:bottom w:type="dxa" w:w="70"/>
+              <w:right w:type="dxa" w:w="100"/>
+            </w:tcMar>
+          </w:tcPr>
+          <w:p>
+            <w:pPr>
+              <w:jc w:val="center"/>
+            </w:pPr>
+            <w:r>
+              <w:rPr>
+                <w:rFonts w:ascii="Arial" w:cs="Arial" w:eastAsia="Arial" w:hAnsi="Arial"/>
+                <w:sz w:val="20"/>
+                <w:szCs w:val="20"/>
+              </w:rPr>
+              <w:t xml:space="preserve">0.819 ± 0.046</w:t>
+            </w:r>
+          </w:p>
+        </w:tc>
+        <w:tc>
+          <w:tcPr>
+            <w:tcW w:type="dxa" w:w="850"/>
+            <w:tcBorders>
+              <w:top w:val="single" w:color="AAAAAA" w:sz="1"/>
+              <w:left w:val="single" w:color="AAAAAA" w:sz="1"/>
+              <w:bottom w:val="single" w:color="AAAAAA" w:sz="1"/>
+              <w:right w:val="single" w:color="AAAAAA" w:sz="1"/>
+            </w:tcBorders>
+            <w:shd w:fill="FFF2CC" w:val="clear"/>
+            <w:tcMar>
+              <w:top w:type="dxa" w:w="70"/>
+              <w:left w:type="dxa" w:w="100"/>
+              <w:bottom w:type="dxa" w:w="70"/>
+              <w:right w:type="dxa" w:w="100"/>
+            </w:tcMar>
+          </w:tcPr>
+          <w:p>
+            <w:pPr>
+              <w:jc w:val="center"/>
+            </w:pPr>
+            <w:r>
+              <w:rPr>
+                <w:rFonts w:ascii="Arial" w:cs="Arial" w:eastAsia="Arial" w:hAnsi="Arial"/>
+                <w:sz w:val="20"/>
+                <w:szCs w:val="20"/>
+              </w:rPr>
+              <w:t xml:space="preserve">0.759 ± 0.032</w:t>
+            </w:r>
+          </w:p>
+        </w:tc>
+        <w:tc>
+          <w:tcPr>
+            <w:tcW w:type="dxa" w:w="850"/>
+            <w:tcBorders>
+              <w:top w:val="single" w:color="AAAAAA" w:sz="1"/>
+              <w:left w:val="single" w:color="AAAAAA" w:sz="1"/>
+              <w:bottom w:val="single" w:color="AAAAAA" w:sz="1"/>
+              <w:right w:val="single" w:color="AAAAAA" w:sz="1"/>
+            </w:tcBorders>
+            <w:shd w:fill="FFF2CC" w:val="clear"/>
+            <w:tcMar>
+              <w:top w:type="dxa" w:w="70"/>
+              <w:left w:type="dxa" w:w="100"/>
+              <w:bottom w:type="dxa" w:w="70"/>
+              <w:right w:type="dxa" w:w="100"/>
+            </w:tcMar>
+          </w:tcPr>
+          <w:p>
+            <w:pPr>
+              <w:jc w:val="center"/>
+            </w:pPr>
+            <w:r>
+              <w:rPr>
+                <w:rFonts w:ascii="Arial" w:cs="Arial" w:eastAsia="Arial" w:hAnsi="Arial"/>
+                <w:sz w:val="20"/>
+                <w:szCs w:val="20"/>
+              </w:rPr>
+              <w:t xml:space="preserve">0.673 ± 0.056</w:t>
             </w:r>
           </w:p>
         </w:tc>
@@ -3092,26 +3820,19 @@
     </w:p>
     <w:tbl>
       <w:tblPr>
-        <w:tblW w:type="dxa" w:w="9360"/>
-        <w:tblBorders>
-          <w:top w:val="single" w:color="auto" w:sz="4"/>
-          <w:left w:val="single" w:color="auto" w:sz="4"/>
-          <w:bottom w:val="single" w:color="auto" w:sz="4"/>
-          <w:right w:val="single" w:color="auto" w:sz="4"/>
-          <w:insideH w:val="single" w:color="auto" w:sz="4"/>
-          <w:insideV w:val="single" w:color="auto" w:sz="4"/>
-        </w:tblBorders>
+        <w:tblW w:type="dxa" w:w="11000"/>
+        <w:tblLayout w:type="fixed"/>
       </w:tblPr>
       <w:tblGrid>
         <w:gridCol w:w="1900"/>
         <w:gridCol w:w="1300"/>
+        <w:gridCol w:w="1300"/>
+        <w:gridCol w:w="1000"/>
         <w:gridCol w:w="1100"/>
-        <w:gridCol w:w="1000"/>
-        <w:gridCol w:w="800"/>
-        <w:gridCol w:w="800"/>
-        <w:gridCol w:w="800"/>
-        <w:gridCol w:w="800"/>
-        <w:gridCol w:w="860"/>
+        <w:gridCol w:w="1100"/>
+        <w:gridCol w:w="1100"/>
+        <w:gridCol w:w="1100"/>
+        <w:gridCol w:w="1100"/>
       </w:tblGrid>
       <w:tr>
         <w:tc>
@@ -3182,7 +3903,7 @@
         </w:tc>
         <w:tc>
           <w:tcPr>
-            <w:tcW w:type="dxa" w:w="1100"/>
+            <w:tcW w:type="dxa" w:w="1300"/>
             <w:tcBorders>
               <w:top w:val="single" w:color="AAAAAA" w:sz="1"/>
               <w:left w:val="single" w:color="AAAAAA" w:sz="1"/>
@@ -3248,7 +3969,7 @@
         </w:tc>
         <w:tc>
           <w:tcPr>
-            <w:tcW w:type="dxa" w:w="800"/>
+            <w:tcW w:type="dxa" w:w="1100"/>
             <w:tcBorders>
               <w:top w:val="single" w:color="AAAAAA" w:sz="1"/>
               <w:left w:val="single" w:color="AAAAAA" w:sz="1"/>
@@ -3281,7 +4002,7 @@
         </w:tc>
         <w:tc>
           <w:tcPr>
-            <w:tcW w:type="dxa" w:w="800"/>
+            <w:tcW w:type="dxa" w:w="1100"/>
             <w:tcBorders>
               <w:top w:val="single" w:color="AAAAAA" w:sz="1"/>
               <w:left w:val="single" w:color="AAAAAA" w:sz="1"/>
@@ -3314,7 +4035,7 @@
         </w:tc>
         <w:tc>
           <w:tcPr>
-            <w:tcW w:type="dxa" w:w="800"/>
+            <w:tcW w:type="dxa" w:w="1100"/>
             <w:tcBorders>
               <w:top w:val="single" w:color="AAAAAA" w:sz="1"/>
               <w:left w:val="single" w:color="AAAAAA" w:sz="1"/>
@@ -3347,7 +4068,7 @@
         </w:tc>
         <w:tc>
           <w:tcPr>
-            <w:tcW w:type="dxa" w:w="800"/>
+            <w:tcW w:type="dxa" w:w="1100"/>
             <w:tcBorders>
               <w:top w:val="single" w:color="AAAAAA" w:sz="1"/>
               <w:left w:val="single" w:color="AAAAAA" w:sz="1"/>
@@ -3380,7 +4101,7 @@
         </w:tc>
         <w:tc>
           <w:tcPr>
-            <w:tcW w:type="dxa" w:w="860"/>
+            <w:tcW w:type="dxa" w:w="1100"/>
             <w:tcBorders>
               <w:top w:val="single" w:color="AAAAAA" w:sz="1"/>
               <w:left w:val="single" w:color="AAAAAA" w:sz="1"/>
@@ -3475,6 +4196,66 @@
         </w:tc>
         <w:tc>
           <w:tcPr>
+            <w:tcW w:type="dxa" w:w="1300"/>
+            <w:tcBorders>
+              <w:top w:val="single" w:color="AAAAAA" w:sz="1"/>
+              <w:left w:val="single" w:color="AAAAAA" w:sz="1"/>
+              <w:bottom w:val="single" w:color="AAAAAA" w:sz="1"/>
+              <w:right w:val="single" w:color="AAAAAA" w:sz="1"/>
+            </w:tcBorders>
+            <w:tcMar>
+              <w:top w:type="dxa" w:w="70"/>
+              <w:left w:type="dxa" w:w="100"/>
+              <w:bottom w:type="dxa" w:w="70"/>
+              <w:right w:type="dxa" w:w="100"/>
+            </w:tcMar>
+          </w:tcPr>
+          <w:p>
+            <w:pPr>
+              <w:jc w:val="center"/>
+            </w:pPr>
+            <w:r>
+              <w:rPr>
+                <w:rFonts w:ascii="Arial" w:cs="Arial" w:eastAsia="Arial" w:hAnsi="Arial"/>
+                <w:sz w:val="20"/>
+                <w:szCs w:val="20"/>
+              </w:rPr>
+              <w:t xml:space="preserve">0.515 ± 0.017</w:t>
+            </w:r>
+          </w:p>
+        </w:tc>
+        <w:tc>
+          <w:tcPr>
+            <w:tcW w:type="dxa" w:w="1000"/>
+            <w:tcBorders>
+              <w:top w:val="single" w:color="AAAAAA" w:sz="1"/>
+              <w:left w:val="single" w:color="AAAAAA" w:sz="1"/>
+              <w:bottom w:val="single" w:color="AAAAAA" w:sz="1"/>
+              <w:right w:val="single" w:color="AAAAAA" w:sz="1"/>
+            </w:tcBorders>
+            <w:tcMar>
+              <w:top w:type="dxa" w:w="70"/>
+              <w:left w:type="dxa" w:w="100"/>
+              <w:bottom w:type="dxa" w:w="70"/>
+              <w:right w:type="dxa" w:w="100"/>
+            </w:tcMar>
+          </w:tcPr>
+          <w:p>
+            <w:pPr>
+              <w:jc w:val="center"/>
+            </w:pPr>
+            <w:r>
+              <w:rPr>
+                <w:rFonts w:ascii="Arial" w:cs="Arial" w:eastAsia="Arial" w:hAnsi="Arial"/>
+                <w:sz w:val="20"/>
+                <w:szCs w:val="20"/>
+              </w:rPr>
+              <w:t xml:space="preserve">0.475 ± 0.031</w:t>
+            </w:r>
+          </w:p>
+        </w:tc>
+        <w:tc>
+          <w:tcPr>
             <w:tcW w:type="dxa" w:w="1100"/>
             <w:tcBorders>
               <w:top w:val="single" w:color="AAAAAA" w:sz="1"/>
@@ -3499,187 +4280,127 @@
                 <w:sz w:val="20"/>
                 <w:szCs w:val="20"/>
               </w:rPr>
-              <w:t xml:space="preserve">0.515 ± 0.017</w:t>
-            </w:r>
-          </w:p>
-        </w:tc>
-        <w:tc>
-          <w:tcPr>
-            <w:tcW w:type="dxa" w:w="1000"/>
-            <w:tcBorders>
-              <w:top w:val="single" w:color="AAAAAA" w:sz="1"/>
-              <w:left w:val="single" w:color="AAAAAA" w:sz="1"/>
-              <w:bottom w:val="single" w:color="AAAAAA" w:sz="1"/>
-              <w:right w:val="single" w:color="AAAAAA" w:sz="1"/>
-            </w:tcBorders>
-            <w:tcMar>
-              <w:top w:type="dxa" w:w="70"/>
-              <w:left w:type="dxa" w:w="100"/>
-              <w:bottom w:type="dxa" w:w="70"/>
-              <w:right w:type="dxa" w:w="100"/>
-            </w:tcMar>
-          </w:tcPr>
-          <w:p>
-            <w:pPr>
-              <w:jc w:val="center"/>
-            </w:pPr>
-            <w:r>
-              <w:rPr>
-                <w:rFonts w:ascii="Arial" w:cs="Arial" w:eastAsia="Arial" w:hAnsi="Arial"/>
-                <w:sz w:val="20"/>
-                <w:szCs w:val="20"/>
-              </w:rPr>
-              <w:t xml:space="preserve">0.475 ± 0.031</w:t>
-            </w:r>
-          </w:p>
-        </w:tc>
-        <w:tc>
-          <w:tcPr>
-            <w:tcW w:type="dxa" w:w="800"/>
-            <w:tcBorders>
-              <w:top w:val="single" w:color="AAAAAA" w:sz="1"/>
-              <w:left w:val="single" w:color="AAAAAA" w:sz="1"/>
-              <w:bottom w:val="single" w:color="AAAAAA" w:sz="1"/>
-              <w:right w:val="single" w:color="AAAAAA" w:sz="1"/>
-            </w:tcBorders>
-            <w:tcMar>
-              <w:top w:type="dxa" w:w="70"/>
-              <w:left w:type="dxa" w:w="100"/>
-              <w:bottom w:type="dxa" w:w="70"/>
-              <w:right w:type="dxa" w:w="100"/>
-            </w:tcMar>
-          </w:tcPr>
-          <w:p>
-            <w:pPr>
-              <w:jc w:val="center"/>
-            </w:pPr>
-            <w:r>
-              <w:rPr>
-                <w:rFonts w:ascii="Arial" w:cs="Arial" w:eastAsia="Arial" w:hAnsi="Arial"/>
-                <w:sz w:val="20"/>
-                <w:szCs w:val="20"/>
-              </w:rPr>
-              <w:t xml:space="preserve">0.703</w:t>
-            </w:r>
-          </w:p>
-        </w:tc>
-        <w:tc>
-          <w:tcPr>
-            <w:tcW w:type="dxa" w:w="800"/>
-            <w:tcBorders>
-              <w:top w:val="single" w:color="AAAAAA" w:sz="1"/>
-              <w:left w:val="single" w:color="AAAAAA" w:sz="1"/>
-              <w:bottom w:val="single" w:color="AAAAAA" w:sz="1"/>
-              <w:right w:val="single" w:color="AAAAAA" w:sz="1"/>
-            </w:tcBorders>
-            <w:tcMar>
-              <w:top w:type="dxa" w:w="70"/>
-              <w:left w:type="dxa" w:w="100"/>
-              <w:bottom w:type="dxa" w:w="70"/>
-              <w:right w:type="dxa" w:w="100"/>
-            </w:tcMar>
-          </w:tcPr>
-          <w:p>
-            <w:pPr>
-              <w:jc w:val="center"/>
-            </w:pPr>
-            <w:r>
-              <w:rPr>
-                <w:rFonts w:ascii="Arial" w:cs="Arial" w:eastAsia="Arial" w:hAnsi="Arial"/>
-                <w:sz w:val="20"/>
-                <w:szCs w:val="20"/>
-              </w:rPr>
-              <w:t xml:space="preserve">0.097</w:t>
-            </w:r>
-          </w:p>
-        </w:tc>
-        <w:tc>
-          <w:tcPr>
-            <w:tcW w:type="dxa" w:w="800"/>
-            <w:tcBorders>
-              <w:top w:val="single" w:color="AAAAAA" w:sz="1"/>
-              <w:left w:val="single" w:color="AAAAAA" w:sz="1"/>
-              <w:bottom w:val="single" w:color="AAAAAA" w:sz="1"/>
-              <w:right w:val="single" w:color="AAAAAA" w:sz="1"/>
-            </w:tcBorders>
-            <w:tcMar>
-              <w:top w:type="dxa" w:w="70"/>
-              <w:left w:type="dxa" w:w="100"/>
-              <w:bottom w:type="dxa" w:w="70"/>
-              <w:right w:type="dxa" w:w="100"/>
-            </w:tcMar>
-          </w:tcPr>
-          <w:p>
-            <w:pPr>
-              <w:jc w:val="center"/>
-            </w:pPr>
-            <w:r>
-              <w:rPr>
-                <w:rFonts w:ascii="Arial" w:cs="Arial" w:eastAsia="Arial" w:hAnsi="Arial"/>
-                <w:sz w:val="20"/>
-                <w:szCs w:val="20"/>
-              </w:rPr>
-              <w:t xml:space="preserve">0.693</w:t>
-            </w:r>
-          </w:p>
-        </w:tc>
-        <w:tc>
-          <w:tcPr>
-            <w:tcW w:type="dxa" w:w="800"/>
-            <w:tcBorders>
-              <w:top w:val="single" w:color="AAAAAA" w:sz="1"/>
-              <w:left w:val="single" w:color="AAAAAA" w:sz="1"/>
-              <w:bottom w:val="single" w:color="AAAAAA" w:sz="1"/>
-              <w:right w:val="single" w:color="AAAAAA" w:sz="1"/>
-            </w:tcBorders>
-            <w:tcMar>
-              <w:top w:type="dxa" w:w="70"/>
-              <w:left w:type="dxa" w:w="100"/>
-              <w:bottom w:type="dxa" w:w="70"/>
-              <w:right w:type="dxa" w:w="100"/>
-            </w:tcMar>
-          </w:tcPr>
-          <w:p>
-            <w:pPr>
-              <w:jc w:val="center"/>
-            </w:pPr>
-            <w:r>
-              <w:rPr>
-                <w:rFonts w:ascii="Arial" w:cs="Arial" w:eastAsia="Arial" w:hAnsi="Arial"/>
-                <w:sz w:val="20"/>
-                <w:szCs w:val="20"/>
-              </w:rPr>
-              <w:t xml:space="preserve">0.415</w:t>
-            </w:r>
-          </w:p>
-        </w:tc>
-        <w:tc>
-          <w:tcPr>
-            <w:tcW w:type="dxa" w:w="860"/>
-            <w:tcBorders>
-              <w:top w:val="single" w:color="AAAAAA" w:sz="1"/>
-              <w:left w:val="single" w:color="AAAAAA" w:sz="1"/>
-              <w:bottom w:val="single" w:color="AAAAAA" w:sz="1"/>
-              <w:right w:val="single" w:color="AAAAAA" w:sz="1"/>
-            </w:tcBorders>
-            <w:tcMar>
-              <w:top w:type="dxa" w:w="70"/>
-              <w:left w:type="dxa" w:w="100"/>
-              <w:bottom w:type="dxa" w:w="70"/>
-              <w:right w:type="dxa" w:w="100"/>
-            </w:tcMar>
-          </w:tcPr>
-          <w:p>
-            <w:pPr>
-              <w:jc w:val="center"/>
-            </w:pPr>
-            <w:r>
-              <w:rPr>
-                <w:rFonts w:ascii="Arial" w:cs="Arial" w:eastAsia="Arial" w:hAnsi="Arial"/>
-                <w:sz w:val="20"/>
-                <w:szCs w:val="20"/>
-              </w:rPr>
-              <w:t xml:space="preserve">0.643</w:t>
+              <w:t xml:space="preserve">0.703 ± 0.042</w:t>
+            </w:r>
+          </w:p>
+        </w:tc>
+        <w:tc>
+          <w:tcPr>
+            <w:tcW w:type="dxa" w:w="1100"/>
+            <w:tcBorders>
+              <w:top w:val="single" w:color="AAAAAA" w:sz="1"/>
+              <w:left w:val="single" w:color="AAAAAA" w:sz="1"/>
+              <w:bottom w:val="single" w:color="AAAAAA" w:sz="1"/>
+              <w:right w:val="single" w:color="AAAAAA" w:sz="1"/>
+            </w:tcBorders>
+            <w:tcMar>
+              <w:top w:type="dxa" w:w="70"/>
+              <w:left w:type="dxa" w:w="100"/>
+              <w:bottom w:type="dxa" w:w="70"/>
+              <w:right w:type="dxa" w:w="100"/>
+            </w:tcMar>
+          </w:tcPr>
+          <w:p>
+            <w:pPr>
+              <w:jc w:val="center"/>
+            </w:pPr>
+            <w:r>
+              <w:rPr>
+                <w:rFonts w:ascii="Arial" w:cs="Arial" w:eastAsia="Arial" w:hAnsi="Arial"/>
+                <w:sz w:val="20"/>
+                <w:szCs w:val="20"/>
+              </w:rPr>
+              <w:t xml:space="preserve">0.097 ± 0.023</w:t>
+            </w:r>
+          </w:p>
+        </w:tc>
+        <w:tc>
+          <w:tcPr>
+            <w:tcW w:type="dxa" w:w="1100"/>
+            <w:tcBorders>
+              <w:top w:val="single" w:color="AAAAAA" w:sz="1"/>
+              <w:left w:val="single" w:color="AAAAAA" w:sz="1"/>
+              <w:bottom w:val="single" w:color="AAAAAA" w:sz="1"/>
+              <w:right w:val="single" w:color="AAAAAA" w:sz="1"/>
+            </w:tcBorders>
+            <w:tcMar>
+              <w:top w:type="dxa" w:w="70"/>
+              <w:left w:type="dxa" w:w="100"/>
+              <w:bottom w:type="dxa" w:w="70"/>
+              <w:right w:type="dxa" w:w="100"/>
+            </w:tcMar>
+          </w:tcPr>
+          <w:p>
+            <w:pPr>
+              <w:jc w:val="center"/>
+            </w:pPr>
+            <w:r>
+              <w:rPr>
+                <w:rFonts w:ascii="Arial" w:cs="Arial" w:eastAsia="Arial" w:hAnsi="Arial"/>
+                <w:sz w:val="20"/>
+                <w:szCs w:val="20"/>
+              </w:rPr>
+              <w:t xml:space="preserve">0.693 ± 0.047</w:t>
+            </w:r>
+          </w:p>
+        </w:tc>
+        <w:tc>
+          <w:tcPr>
+            <w:tcW w:type="dxa" w:w="1100"/>
+            <w:tcBorders>
+              <w:top w:val="single" w:color="AAAAAA" w:sz="1"/>
+              <w:left w:val="single" w:color="AAAAAA" w:sz="1"/>
+              <w:bottom w:val="single" w:color="AAAAAA" w:sz="1"/>
+              <w:right w:val="single" w:color="AAAAAA" w:sz="1"/>
+            </w:tcBorders>
+            <w:tcMar>
+              <w:top w:type="dxa" w:w="70"/>
+              <w:left w:type="dxa" w:w="100"/>
+              <w:bottom w:type="dxa" w:w="70"/>
+              <w:right w:type="dxa" w:w="100"/>
+            </w:tcMar>
+          </w:tcPr>
+          <w:p>
+            <w:pPr>
+              <w:jc w:val="center"/>
+            </w:pPr>
+            <w:r>
+              <w:rPr>
+                <w:rFonts w:ascii="Arial" w:cs="Arial" w:eastAsia="Arial" w:hAnsi="Arial"/>
+                <w:sz w:val="20"/>
+                <w:szCs w:val="20"/>
+              </w:rPr>
+              <w:t xml:space="preserve">0.415 ± 0.075</w:t>
+            </w:r>
+          </w:p>
+        </w:tc>
+        <w:tc>
+          <w:tcPr>
+            <w:tcW w:type="dxa" w:w="1100"/>
+            <w:tcBorders>
+              <w:top w:val="single" w:color="AAAAAA" w:sz="1"/>
+              <w:left w:val="single" w:color="AAAAAA" w:sz="1"/>
+              <w:bottom w:val="single" w:color="AAAAAA" w:sz="1"/>
+              <w:right w:val="single" w:color="AAAAAA" w:sz="1"/>
+            </w:tcBorders>
+            <w:tcMar>
+              <w:top w:type="dxa" w:w="70"/>
+              <w:left w:type="dxa" w:w="100"/>
+              <w:bottom w:type="dxa" w:w="70"/>
+              <w:right w:type="dxa" w:w="100"/>
+            </w:tcMar>
+          </w:tcPr>
+          <w:p>
+            <w:pPr>
+              <w:jc w:val="center"/>
+            </w:pPr>
+            <w:r>
+              <w:rPr>
+                <w:rFonts w:ascii="Arial" w:cs="Arial" w:eastAsia="Arial" w:hAnsi="Arial"/>
+                <w:sz w:val="20"/>
+                <w:szCs w:val="20"/>
+              </w:rPr>
+              <w:t xml:space="preserve">0.643 ± 0.043</w:t>
             </w:r>
           </w:p>
         </w:tc>
@@ -3747,6 +4468,66 @@
         </w:tc>
         <w:tc>
           <w:tcPr>
+            <w:tcW w:type="dxa" w:w="1300"/>
+            <w:tcBorders>
+              <w:top w:val="single" w:color="AAAAAA" w:sz="1"/>
+              <w:left w:val="single" w:color="AAAAAA" w:sz="1"/>
+              <w:bottom w:val="single" w:color="AAAAAA" w:sz="1"/>
+              <w:right w:val="single" w:color="AAAAAA" w:sz="1"/>
+            </w:tcBorders>
+            <w:tcMar>
+              <w:top w:type="dxa" w:w="70"/>
+              <w:left w:type="dxa" w:w="100"/>
+              <w:bottom w:type="dxa" w:w="70"/>
+              <w:right w:type="dxa" w:w="100"/>
+            </w:tcMar>
+          </w:tcPr>
+          <w:p>
+            <w:pPr>
+              <w:jc w:val="center"/>
+            </w:pPr>
+            <w:r>
+              <w:rPr>
+                <w:rFonts w:ascii="Arial" w:cs="Arial" w:eastAsia="Arial" w:hAnsi="Arial"/>
+                <w:sz w:val="20"/>
+                <w:szCs w:val="20"/>
+              </w:rPr>
+              <w:t xml:space="preserve">0.512 ± 0.022</w:t>
+            </w:r>
+          </w:p>
+        </w:tc>
+        <w:tc>
+          <w:tcPr>
+            <w:tcW w:type="dxa" w:w="1000"/>
+            <w:tcBorders>
+              <w:top w:val="single" w:color="AAAAAA" w:sz="1"/>
+              <w:left w:val="single" w:color="AAAAAA" w:sz="1"/>
+              <w:bottom w:val="single" w:color="AAAAAA" w:sz="1"/>
+              <w:right w:val="single" w:color="AAAAAA" w:sz="1"/>
+            </w:tcBorders>
+            <w:tcMar>
+              <w:top w:type="dxa" w:w="70"/>
+              <w:left w:type="dxa" w:w="100"/>
+              <w:bottom w:type="dxa" w:w="70"/>
+              <w:right w:type="dxa" w:w="100"/>
+            </w:tcMar>
+          </w:tcPr>
+          <w:p>
+            <w:pPr>
+              <w:jc w:val="center"/>
+            </w:pPr>
+            <w:r>
+              <w:rPr>
+                <w:rFonts w:ascii="Arial" w:cs="Arial" w:eastAsia="Arial" w:hAnsi="Arial"/>
+                <w:sz w:val="20"/>
+                <w:szCs w:val="20"/>
+              </w:rPr>
+              <w:t xml:space="preserve">0.493 ± 0.040</w:t>
+            </w:r>
+          </w:p>
+        </w:tc>
+        <w:tc>
+          <w:tcPr>
             <w:tcW w:type="dxa" w:w="1100"/>
             <w:tcBorders>
               <w:top w:val="single" w:color="AAAAAA" w:sz="1"/>
@@ -3771,187 +4552,127 @@
                 <w:sz w:val="20"/>
                 <w:szCs w:val="20"/>
               </w:rPr>
-              <w:t xml:space="preserve">0.512 ± 0.022</w:t>
-            </w:r>
-          </w:p>
-        </w:tc>
-        <w:tc>
-          <w:tcPr>
-            <w:tcW w:type="dxa" w:w="1000"/>
-            <w:tcBorders>
-              <w:top w:val="single" w:color="AAAAAA" w:sz="1"/>
-              <w:left w:val="single" w:color="AAAAAA" w:sz="1"/>
-              <w:bottom w:val="single" w:color="AAAAAA" w:sz="1"/>
-              <w:right w:val="single" w:color="AAAAAA" w:sz="1"/>
-            </w:tcBorders>
-            <w:tcMar>
-              <w:top w:type="dxa" w:w="70"/>
-              <w:left w:type="dxa" w:w="100"/>
-              <w:bottom w:type="dxa" w:w="70"/>
-              <w:right w:type="dxa" w:w="100"/>
-            </w:tcMar>
-          </w:tcPr>
-          <w:p>
-            <w:pPr>
-              <w:jc w:val="center"/>
-            </w:pPr>
-            <w:r>
-              <w:rPr>
-                <w:rFonts w:ascii="Arial" w:cs="Arial" w:eastAsia="Arial" w:hAnsi="Arial"/>
-                <w:sz w:val="20"/>
-                <w:szCs w:val="20"/>
-              </w:rPr>
-              <w:t xml:space="preserve">0.493 ± 0.040</w:t>
-            </w:r>
-          </w:p>
-        </w:tc>
-        <w:tc>
-          <w:tcPr>
-            <w:tcW w:type="dxa" w:w="800"/>
-            <w:tcBorders>
-              <w:top w:val="single" w:color="AAAAAA" w:sz="1"/>
-              <w:left w:val="single" w:color="AAAAAA" w:sz="1"/>
-              <w:bottom w:val="single" w:color="AAAAAA" w:sz="1"/>
-              <w:right w:val="single" w:color="AAAAAA" w:sz="1"/>
-            </w:tcBorders>
-            <w:tcMar>
-              <w:top w:type="dxa" w:w="70"/>
-              <w:left w:type="dxa" w:w="100"/>
-              <w:bottom w:type="dxa" w:w="70"/>
-              <w:right w:type="dxa" w:w="100"/>
-            </w:tcMar>
-          </w:tcPr>
-          <w:p>
-            <w:pPr>
-              <w:jc w:val="center"/>
-            </w:pPr>
-            <w:r>
-              <w:rPr>
-                <w:rFonts w:ascii="Arial" w:cs="Arial" w:eastAsia="Arial" w:hAnsi="Arial"/>
-                <w:sz w:val="20"/>
-                <w:szCs w:val="20"/>
-              </w:rPr>
-              <w:t xml:space="preserve">0.727</w:t>
-            </w:r>
-          </w:p>
-        </w:tc>
-        <w:tc>
-          <w:tcPr>
-            <w:tcW w:type="dxa" w:w="800"/>
-            <w:tcBorders>
-              <w:top w:val="single" w:color="AAAAAA" w:sz="1"/>
-              <w:left w:val="single" w:color="AAAAAA" w:sz="1"/>
-              <w:bottom w:val="single" w:color="AAAAAA" w:sz="1"/>
-              <w:right w:val="single" w:color="AAAAAA" w:sz="1"/>
-            </w:tcBorders>
-            <w:tcMar>
-              <w:top w:type="dxa" w:w="70"/>
-              <w:left w:type="dxa" w:w="100"/>
-              <w:bottom w:type="dxa" w:w="70"/>
-              <w:right w:type="dxa" w:w="100"/>
-            </w:tcMar>
-          </w:tcPr>
-          <w:p>
-            <w:pPr>
-              <w:jc w:val="center"/>
-            </w:pPr>
-            <w:r>
-              <w:rPr>
-                <w:rFonts w:ascii="Arial" w:cs="Arial" w:eastAsia="Arial" w:hAnsi="Arial"/>
-                <w:sz w:val="20"/>
-                <w:szCs w:val="20"/>
-              </w:rPr>
-              <w:t xml:space="preserve">0.076</w:t>
-            </w:r>
-          </w:p>
-        </w:tc>
-        <w:tc>
-          <w:tcPr>
-            <w:tcW w:type="dxa" w:w="800"/>
-            <w:tcBorders>
-              <w:top w:val="single" w:color="AAAAAA" w:sz="1"/>
-              <w:left w:val="single" w:color="AAAAAA" w:sz="1"/>
-              <w:bottom w:val="single" w:color="AAAAAA" w:sz="1"/>
-              <w:right w:val="single" w:color="AAAAAA" w:sz="1"/>
-            </w:tcBorders>
-            <w:tcMar>
-              <w:top w:type="dxa" w:w="70"/>
-              <w:left w:type="dxa" w:w="100"/>
-              <w:bottom w:type="dxa" w:w="70"/>
-              <w:right w:type="dxa" w:w="100"/>
-            </w:tcMar>
-          </w:tcPr>
-          <w:p>
-            <w:pPr>
-              <w:jc w:val="center"/>
-            </w:pPr>
-            <w:r>
-              <w:rPr>
-                <w:rFonts w:ascii="Arial" w:cs="Arial" w:eastAsia="Arial" w:hAnsi="Arial"/>
-                <w:sz w:val="20"/>
-                <w:szCs w:val="20"/>
-              </w:rPr>
-              <w:t xml:space="preserve">0.710</w:t>
-            </w:r>
-          </w:p>
-        </w:tc>
-        <w:tc>
-          <w:tcPr>
-            <w:tcW w:type="dxa" w:w="800"/>
-            <w:tcBorders>
-              <w:top w:val="single" w:color="AAAAAA" w:sz="1"/>
-              <w:left w:val="single" w:color="AAAAAA" w:sz="1"/>
-              <w:bottom w:val="single" w:color="AAAAAA" w:sz="1"/>
-              <w:right w:val="single" w:color="AAAAAA" w:sz="1"/>
-            </w:tcBorders>
-            <w:tcMar>
-              <w:top w:type="dxa" w:w="70"/>
-              <w:left w:type="dxa" w:w="100"/>
-              <w:bottom w:type="dxa" w:w="70"/>
-              <w:right w:type="dxa" w:w="100"/>
-            </w:tcMar>
-          </w:tcPr>
-          <w:p>
-            <w:pPr>
-              <w:jc w:val="center"/>
-            </w:pPr>
-            <w:r>
-              <w:rPr>
-                <w:rFonts w:ascii="Arial" w:cs="Arial" w:eastAsia="Arial" w:hAnsi="Arial"/>
-                <w:sz w:val="20"/>
-                <w:szCs w:val="20"/>
-              </w:rPr>
-              <w:t xml:space="preserve">0.401</w:t>
-            </w:r>
-          </w:p>
-        </w:tc>
-        <w:tc>
-          <w:tcPr>
-            <w:tcW w:type="dxa" w:w="860"/>
-            <w:tcBorders>
-              <w:top w:val="single" w:color="AAAAAA" w:sz="1"/>
-              <w:left w:val="single" w:color="AAAAAA" w:sz="1"/>
-              <w:bottom w:val="single" w:color="AAAAAA" w:sz="1"/>
-              <w:right w:val="single" w:color="AAAAAA" w:sz="1"/>
-            </w:tcBorders>
-            <w:tcMar>
-              <w:top w:type="dxa" w:w="70"/>
-              <w:left w:type="dxa" w:w="100"/>
-              <w:bottom w:type="dxa" w:w="70"/>
-              <w:right w:type="dxa" w:w="100"/>
-            </w:tcMar>
-          </w:tcPr>
-          <w:p>
-            <w:pPr>
-              <w:jc w:val="center"/>
-            </w:pPr>
-            <w:r>
-              <w:rPr>
-                <w:rFonts w:ascii="Arial" w:cs="Arial" w:eastAsia="Arial" w:hAnsi="Arial"/>
-                <w:sz w:val="20"/>
-                <w:szCs w:val="20"/>
-              </w:rPr>
-              <w:t xml:space="preserve">0.660</w:t>
+              <w:t xml:space="preserve">0.727 ± 0.029</w:t>
+            </w:r>
+          </w:p>
+        </w:tc>
+        <w:tc>
+          <w:tcPr>
+            <w:tcW w:type="dxa" w:w="1100"/>
+            <w:tcBorders>
+              <w:top w:val="single" w:color="AAAAAA" w:sz="1"/>
+              <w:left w:val="single" w:color="AAAAAA" w:sz="1"/>
+              <w:bottom w:val="single" w:color="AAAAAA" w:sz="1"/>
+              <w:right w:val="single" w:color="AAAAAA" w:sz="1"/>
+            </w:tcBorders>
+            <w:tcMar>
+              <w:top w:type="dxa" w:w="70"/>
+              <w:left w:type="dxa" w:w="100"/>
+              <w:bottom w:type="dxa" w:w="70"/>
+              <w:right w:type="dxa" w:w="100"/>
+            </w:tcMar>
+          </w:tcPr>
+          <w:p>
+            <w:pPr>
+              <w:jc w:val="center"/>
+            </w:pPr>
+            <w:r>
+              <w:rPr>
+                <w:rFonts w:ascii="Arial" w:cs="Arial" w:eastAsia="Arial" w:hAnsi="Arial"/>
+                <w:sz w:val="20"/>
+                <w:szCs w:val="20"/>
+              </w:rPr>
+              <w:t xml:space="preserve">0.076 ± 0.018</w:t>
+            </w:r>
+          </w:p>
+        </w:tc>
+        <w:tc>
+          <w:tcPr>
+            <w:tcW w:type="dxa" w:w="1100"/>
+            <w:tcBorders>
+              <w:top w:val="single" w:color="AAAAAA" w:sz="1"/>
+              <w:left w:val="single" w:color="AAAAAA" w:sz="1"/>
+              <w:bottom w:val="single" w:color="AAAAAA" w:sz="1"/>
+              <w:right w:val="single" w:color="AAAAAA" w:sz="1"/>
+            </w:tcBorders>
+            <w:tcMar>
+              <w:top w:type="dxa" w:w="70"/>
+              <w:left w:type="dxa" w:w="100"/>
+              <w:bottom w:type="dxa" w:w="70"/>
+              <w:right w:type="dxa" w:w="100"/>
+            </w:tcMar>
+          </w:tcPr>
+          <w:p>
+            <w:pPr>
+              <w:jc w:val="center"/>
+            </w:pPr>
+            <w:r>
+              <w:rPr>
+                <w:rFonts w:ascii="Arial" w:cs="Arial" w:eastAsia="Arial" w:hAnsi="Arial"/>
+                <w:sz w:val="20"/>
+                <w:szCs w:val="20"/>
+              </w:rPr>
+              <w:t xml:space="preserve">0.710 ± 0.039</w:t>
+            </w:r>
+          </w:p>
+        </w:tc>
+        <w:tc>
+          <w:tcPr>
+            <w:tcW w:type="dxa" w:w="1100"/>
+            <w:tcBorders>
+              <w:top w:val="single" w:color="AAAAAA" w:sz="1"/>
+              <w:left w:val="single" w:color="AAAAAA" w:sz="1"/>
+              <w:bottom w:val="single" w:color="AAAAAA" w:sz="1"/>
+              <w:right w:val="single" w:color="AAAAAA" w:sz="1"/>
+            </w:tcBorders>
+            <w:tcMar>
+              <w:top w:type="dxa" w:w="70"/>
+              <w:left w:type="dxa" w:w="100"/>
+              <w:bottom w:type="dxa" w:w="70"/>
+              <w:right w:type="dxa" w:w="100"/>
+            </w:tcMar>
+          </w:tcPr>
+          <w:p>
+            <w:pPr>
+              <w:jc w:val="center"/>
+            </w:pPr>
+            <w:r>
+              <w:rPr>
+                <w:rFonts w:ascii="Arial" w:cs="Arial" w:eastAsia="Arial" w:hAnsi="Arial"/>
+                <w:sz w:val="20"/>
+                <w:szCs w:val="20"/>
+              </w:rPr>
+              <w:t xml:space="preserve">0.401 ± 0.076</w:t>
+            </w:r>
+          </w:p>
+        </w:tc>
+        <w:tc>
+          <w:tcPr>
+            <w:tcW w:type="dxa" w:w="1100"/>
+            <w:tcBorders>
+              <w:top w:val="single" w:color="AAAAAA" w:sz="1"/>
+              <w:left w:val="single" w:color="AAAAAA" w:sz="1"/>
+              <w:bottom w:val="single" w:color="AAAAAA" w:sz="1"/>
+              <w:right w:val="single" w:color="AAAAAA" w:sz="1"/>
+            </w:tcBorders>
+            <w:tcMar>
+              <w:top w:type="dxa" w:w="70"/>
+              <w:left w:type="dxa" w:w="100"/>
+              <w:bottom w:type="dxa" w:w="70"/>
+              <w:right w:type="dxa" w:w="100"/>
+            </w:tcMar>
+          </w:tcPr>
+          <w:p>
+            <w:pPr>
+              <w:jc w:val="center"/>
+            </w:pPr>
+            <w:r>
+              <w:rPr>
+                <w:rFonts w:ascii="Arial" w:cs="Arial" w:eastAsia="Arial" w:hAnsi="Arial"/>
+                <w:sz w:val="20"/>
+                <w:szCs w:val="20"/>
+              </w:rPr>
+              <w:t xml:space="preserve">0.660 ± 0.025</w:t>
             </w:r>
           </w:p>
         </w:tc>
@@ -4019,6 +4740,66 @@
         </w:tc>
         <w:tc>
           <w:tcPr>
+            <w:tcW w:type="dxa" w:w="1300"/>
+            <w:tcBorders>
+              <w:top w:val="single" w:color="AAAAAA" w:sz="1"/>
+              <w:left w:val="single" w:color="AAAAAA" w:sz="1"/>
+              <w:bottom w:val="single" w:color="AAAAAA" w:sz="1"/>
+              <w:right w:val="single" w:color="AAAAAA" w:sz="1"/>
+            </w:tcBorders>
+            <w:tcMar>
+              <w:top w:type="dxa" w:w="70"/>
+              <w:left w:type="dxa" w:w="100"/>
+              <w:bottom w:type="dxa" w:w="70"/>
+              <w:right w:type="dxa" w:w="100"/>
+            </w:tcMar>
+          </w:tcPr>
+          <w:p>
+            <w:pPr>
+              <w:jc w:val="center"/>
+            </w:pPr>
+            <w:r>
+              <w:rPr>
+                <w:rFonts w:ascii="Arial" w:cs="Arial" w:eastAsia="Arial" w:hAnsi="Arial"/>
+                <w:sz w:val="20"/>
+                <w:szCs w:val="20"/>
+              </w:rPr>
+              <w:t xml:space="preserve">0.434 ± 0.027</w:t>
+            </w:r>
+          </w:p>
+        </w:tc>
+        <w:tc>
+          <w:tcPr>
+            <w:tcW w:type="dxa" w:w="1000"/>
+            <w:tcBorders>
+              <w:top w:val="single" w:color="AAAAAA" w:sz="1"/>
+              <w:left w:val="single" w:color="AAAAAA" w:sz="1"/>
+              <w:bottom w:val="single" w:color="AAAAAA" w:sz="1"/>
+              <w:right w:val="single" w:color="AAAAAA" w:sz="1"/>
+            </w:tcBorders>
+            <w:tcMar>
+              <w:top w:type="dxa" w:w="70"/>
+              <w:left w:type="dxa" w:w="100"/>
+              <w:bottom w:type="dxa" w:w="70"/>
+              <w:right w:type="dxa" w:w="100"/>
+            </w:tcMar>
+          </w:tcPr>
+          <w:p>
+            <w:pPr>
+              <w:jc w:val="center"/>
+            </w:pPr>
+            <w:r>
+              <w:rPr>
+                <w:rFonts w:ascii="Arial" w:cs="Arial" w:eastAsia="Arial" w:hAnsi="Arial"/>
+                <w:sz w:val="20"/>
+                <w:szCs w:val="20"/>
+              </w:rPr>
+              <w:t xml:space="preserve">0.340 ± 0.055</w:t>
+            </w:r>
+          </w:p>
+        </w:tc>
+        <w:tc>
+          <w:tcPr>
             <w:tcW w:type="dxa" w:w="1100"/>
             <w:tcBorders>
               <w:top w:val="single" w:color="AAAAAA" w:sz="1"/>
@@ -4043,187 +4824,127 @@
                 <w:sz w:val="20"/>
                 <w:szCs w:val="20"/>
               </w:rPr>
-              <w:t xml:space="preserve">0.434 ± 0.027</w:t>
-            </w:r>
-          </w:p>
-        </w:tc>
-        <w:tc>
-          <w:tcPr>
-            <w:tcW w:type="dxa" w:w="1000"/>
-            <w:tcBorders>
-              <w:top w:val="single" w:color="AAAAAA" w:sz="1"/>
-              <w:left w:val="single" w:color="AAAAAA" w:sz="1"/>
-              <w:bottom w:val="single" w:color="AAAAAA" w:sz="1"/>
-              <w:right w:val="single" w:color="AAAAAA" w:sz="1"/>
-            </w:tcBorders>
-            <w:tcMar>
-              <w:top w:type="dxa" w:w="70"/>
-              <w:left w:type="dxa" w:w="100"/>
-              <w:bottom w:type="dxa" w:w="70"/>
-              <w:right w:type="dxa" w:w="100"/>
-            </w:tcMar>
-          </w:tcPr>
-          <w:p>
-            <w:pPr>
-              <w:jc w:val="center"/>
-            </w:pPr>
-            <w:r>
-              <w:rPr>
-                <w:rFonts w:ascii="Arial" w:cs="Arial" w:eastAsia="Arial" w:hAnsi="Arial"/>
-                <w:sz w:val="20"/>
-                <w:szCs w:val="20"/>
-              </w:rPr>
-              <w:t xml:space="preserve">0.340 ± 0.055</w:t>
-            </w:r>
-          </w:p>
-        </w:tc>
-        <w:tc>
-          <w:tcPr>
-            <w:tcW w:type="dxa" w:w="800"/>
-            <w:tcBorders>
-              <w:top w:val="single" w:color="AAAAAA" w:sz="1"/>
-              <w:left w:val="single" w:color="AAAAAA" w:sz="1"/>
-              <w:bottom w:val="single" w:color="AAAAAA" w:sz="1"/>
-              <w:right w:val="single" w:color="AAAAAA" w:sz="1"/>
-            </w:tcBorders>
-            <w:tcMar>
-              <w:top w:type="dxa" w:w="70"/>
-              <w:left w:type="dxa" w:w="100"/>
-              <w:bottom w:type="dxa" w:w="70"/>
-              <w:right w:type="dxa" w:w="100"/>
-            </w:tcMar>
-          </w:tcPr>
-          <w:p>
-            <w:pPr>
-              <w:jc w:val="center"/>
-            </w:pPr>
-            <w:r>
-              <w:rPr>
-                <w:rFonts w:ascii="Arial" w:cs="Arial" w:eastAsia="Arial" w:hAnsi="Arial"/>
-                <w:sz w:val="20"/>
-                <w:szCs w:val="20"/>
-              </w:rPr>
-              <w:t xml:space="preserve">0.748</w:t>
-            </w:r>
-          </w:p>
-        </w:tc>
-        <w:tc>
-          <w:tcPr>
-            <w:tcW w:type="dxa" w:w="800"/>
-            <w:tcBorders>
-              <w:top w:val="single" w:color="AAAAAA" w:sz="1"/>
-              <w:left w:val="single" w:color="AAAAAA" w:sz="1"/>
-              <w:bottom w:val="single" w:color="AAAAAA" w:sz="1"/>
-              <w:right w:val="single" w:color="AAAAAA" w:sz="1"/>
-            </w:tcBorders>
-            <w:tcMar>
-              <w:top w:type="dxa" w:w="70"/>
-              <w:left w:type="dxa" w:w="100"/>
-              <w:bottom w:type="dxa" w:w="70"/>
-              <w:right w:type="dxa" w:w="100"/>
-            </w:tcMar>
-          </w:tcPr>
-          <w:p>
-            <w:pPr>
-              <w:jc w:val="center"/>
-            </w:pPr>
-            <w:r>
-              <w:rPr>
-                <w:rFonts w:ascii="Arial" w:cs="Arial" w:eastAsia="Arial" w:hAnsi="Arial"/>
-                <w:sz w:val="20"/>
-                <w:szCs w:val="20"/>
-              </w:rPr>
-              <w:t xml:space="preserve">0.080</w:t>
-            </w:r>
-          </w:p>
-        </w:tc>
-        <w:tc>
-          <w:tcPr>
-            <w:tcW w:type="dxa" w:w="800"/>
-            <w:tcBorders>
-              <w:top w:val="single" w:color="AAAAAA" w:sz="1"/>
-              <w:left w:val="single" w:color="AAAAAA" w:sz="1"/>
-              <w:bottom w:val="single" w:color="AAAAAA" w:sz="1"/>
-              <w:right w:val="single" w:color="AAAAAA" w:sz="1"/>
-            </w:tcBorders>
-            <w:tcMar>
-              <w:top w:type="dxa" w:w="70"/>
-              <w:left w:type="dxa" w:w="100"/>
-              <w:bottom w:type="dxa" w:w="70"/>
-              <w:right w:type="dxa" w:w="100"/>
-            </w:tcMar>
-          </w:tcPr>
-          <w:p>
-            <w:pPr>
-              <w:jc w:val="center"/>
-            </w:pPr>
-            <w:r>
-              <w:rPr>
-                <w:rFonts w:ascii="Arial" w:cs="Arial" w:eastAsia="Arial" w:hAnsi="Arial"/>
-                <w:sz w:val="20"/>
-                <w:szCs w:val="20"/>
-              </w:rPr>
-              <w:t xml:space="preserve">0.576</w:t>
-            </w:r>
-          </w:p>
-        </w:tc>
-        <w:tc>
-          <w:tcPr>
-            <w:tcW w:type="dxa" w:w="800"/>
-            <w:tcBorders>
-              <w:top w:val="single" w:color="AAAAAA" w:sz="1"/>
-              <w:left w:val="single" w:color="AAAAAA" w:sz="1"/>
-              <w:bottom w:val="single" w:color="AAAAAA" w:sz="1"/>
-              <w:right w:val="single" w:color="AAAAAA" w:sz="1"/>
-            </w:tcBorders>
-            <w:tcMar>
-              <w:top w:type="dxa" w:w="70"/>
-              <w:left w:type="dxa" w:w="100"/>
-              <w:bottom w:type="dxa" w:w="70"/>
-              <w:right w:type="dxa" w:w="100"/>
-            </w:tcMar>
-          </w:tcPr>
-          <w:p>
-            <w:pPr>
-              <w:jc w:val="center"/>
-            </w:pPr>
-            <w:r>
-              <w:rPr>
-                <w:rFonts w:ascii="Arial" w:cs="Arial" w:eastAsia="Arial" w:hAnsi="Arial"/>
-                <w:sz w:val="20"/>
-                <w:szCs w:val="20"/>
-              </w:rPr>
-              <w:t xml:space="preserve">0.129</w:t>
-            </w:r>
-          </w:p>
-        </w:tc>
-        <w:tc>
-          <w:tcPr>
-            <w:tcW w:type="dxa" w:w="860"/>
-            <w:tcBorders>
-              <w:top w:val="single" w:color="AAAAAA" w:sz="1"/>
-              <w:left w:val="single" w:color="AAAAAA" w:sz="1"/>
-              <w:bottom w:val="single" w:color="AAAAAA" w:sz="1"/>
-              <w:right w:val="single" w:color="AAAAAA" w:sz="1"/>
-            </w:tcBorders>
-            <w:tcMar>
-              <w:top w:type="dxa" w:w="70"/>
-              <w:left w:type="dxa" w:w="100"/>
-              <w:bottom w:type="dxa" w:w="70"/>
-              <w:right w:type="dxa" w:w="100"/>
-            </w:tcMar>
-          </w:tcPr>
-          <w:p>
-            <w:pPr>
-              <w:jc w:val="center"/>
-            </w:pPr>
-            <w:r>
-              <w:rPr>
-                <w:rFonts w:ascii="Arial" w:cs="Arial" w:eastAsia="Arial" w:hAnsi="Arial"/>
-                <w:sz w:val="20"/>
-                <w:szCs w:val="20"/>
-              </w:rPr>
-              <w:t xml:space="preserve">0.480</w:t>
+              <w:t xml:space="preserve">0.748 ± 0.039</w:t>
+            </w:r>
+          </w:p>
+        </w:tc>
+        <w:tc>
+          <w:tcPr>
+            <w:tcW w:type="dxa" w:w="1100"/>
+            <w:tcBorders>
+              <w:top w:val="single" w:color="AAAAAA" w:sz="1"/>
+              <w:left w:val="single" w:color="AAAAAA" w:sz="1"/>
+              <w:bottom w:val="single" w:color="AAAAAA" w:sz="1"/>
+              <w:right w:val="single" w:color="AAAAAA" w:sz="1"/>
+            </w:tcBorders>
+            <w:tcMar>
+              <w:top w:type="dxa" w:w="70"/>
+              <w:left w:type="dxa" w:w="100"/>
+              <w:bottom w:type="dxa" w:w="70"/>
+              <w:right w:type="dxa" w:w="100"/>
+            </w:tcMar>
+          </w:tcPr>
+          <w:p>
+            <w:pPr>
+              <w:jc w:val="center"/>
+            </w:pPr>
+            <w:r>
+              <w:rPr>
+                <w:rFonts w:ascii="Arial" w:cs="Arial" w:eastAsia="Arial" w:hAnsi="Arial"/>
+                <w:sz w:val="20"/>
+                <w:szCs w:val="20"/>
+              </w:rPr>
+              <w:t xml:space="preserve">0.080 ± 0.041</w:t>
+            </w:r>
+          </w:p>
+        </w:tc>
+        <w:tc>
+          <w:tcPr>
+            <w:tcW w:type="dxa" w:w="1100"/>
+            <w:tcBorders>
+              <w:top w:val="single" w:color="AAAAAA" w:sz="1"/>
+              <w:left w:val="single" w:color="AAAAAA" w:sz="1"/>
+              <w:bottom w:val="single" w:color="AAAAAA" w:sz="1"/>
+              <w:right w:val="single" w:color="AAAAAA" w:sz="1"/>
+            </w:tcBorders>
+            <w:tcMar>
+              <w:top w:type="dxa" w:w="70"/>
+              <w:left w:type="dxa" w:w="100"/>
+              <w:bottom w:type="dxa" w:w="70"/>
+              <w:right w:type="dxa" w:w="100"/>
+            </w:tcMar>
+          </w:tcPr>
+          <w:p>
+            <w:pPr>
+              <w:jc w:val="center"/>
+            </w:pPr>
+            <w:r>
+              <w:rPr>
+                <w:rFonts w:ascii="Arial" w:cs="Arial" w:eastAsia="Arial" w:hAnsi="Arial"/>
+                <w:sz w:val="20"/>
+                <w:szCs w:val="20"/>
+              </w:rPr>
+              <w:t xml:space="preserve">0.576 ± 0.104</w:t>
+            </w:r>
+          </w:p>
+        </w:tc>
+        <w:tc>
+          <w:tcPr>
+            <w:tcW w:type="dxa" w:w="1100"/>
+            <w:tcBorders>
+              <w:top w:val="single" w:color="AAAAAA" w:sz="1"/>
+              <w:left w:val="single" w:color="AAAAAA" w:sz="1"/>
+              <w:bottom w:val="single" w:color="AAAAAA" w:sz="1"/>
+              <w:right w:val="single" w:color="AAAAAA" w:sz="1"/>
+            </w:tcBorders>
+            <w:tcMar>
+              <w:top w:type="dxa" w:w="70"/>
+              <w:left w:type="dxa" w:w="100"/>
+              <w:bottom w:type="dxa" w:w="70"/>
+              <w:right w:type="dxa" w:w="100"/>
+            </w:tcMar>
+          </w:tcPr>
+          <w:p>
+            <w:pPr>
+              <w:jc w:val="center"/>
+            </w:pPr>
+            <w:r>
+              <w:rPr>
+                <w:rFonts w:ascii="Arial" w:cs="Arial" w:eastAsia="Arial" w:hAnsi="Arial"/>
+                <w:sz w:val="20"/>
+                <w:szCs w:val="20"/>
+              </w:rPr>
+              <w:t xml:space="preserve">0.129 ± 0.162</w:t>
+            </w:r>
+          </w:p>
+        </w:tc>
+        <w:tc>
+          <w:tcPr>
+            <w:tcW w:type="dxa" w:w="1100"/>
+            <w:tcBorders>
+              <w:top w:val="single" w:color="AAAAAA" w:sz="1"/>
+              <w:left w:val="single" w:color="AAAAAA" w:sz="1"/>
+              <w:bottom w:val="single" w:color="AAAAAA" w:sz="1"/>
+              <w:right w:val="single" w:color="AAAAAA" w:sz="1"/>
+            </w:tcBorders>
+            <w:tcMar>
+              <w:top w:type="dxa" w:w="70"/>
+              <w:left w:type="dxa" w:w="100"/>
+              <w:bottom w:type="dxa" w:w="70"/>
+              <w:right w:type="dxa" w:w="100"/>
+            </w:tcMar>
+          </w:tcPr>
+          <w:p>
+            <w:pPr>
+              <w:jc w:val="center"/>
+            </w:pPr>
+            <w:r>
+              <w:rPr>
+                <w:rFonts w:ascii="Arial" w:cs="Arial" w:eastAsia="Arial" w:hAnsi="Arial"/>
+                <w:sz w:val="20"/>
+                <w:szCs w:val="20"/>
+              </w:rPr>
+              <w:t xml:space="preserve">0.480 ± 0.104</w:t>
             </w:r>
           </w:p>
         </w:tc>
@@ -4291,6 +5012,66 @@
         </w:tc>
         <w:tc>
           <w:tcPr>
+            <w:tcW w:type="dxa" w:w="1300"/>
+            <w:tcBorders>
+              <w:top w:val="single" w:color="AAAAAA" w:sz="1"/>
+              <w:left w:val="single" w:color="AAAAAA" w:sz="1"/>
+              <w:bottom w:val="single" w:color="AAAAAA" w:sz="1"/>
+              <w:right w:val="single" w:color="AAAAAA" w:sz="1"/>
+            </w:tcBorders>
+            <w:tcMar>
+              <w:top w:type="dxa" w:w="70"/>
+              <w:left w:type="dxa" w:w="100"/>
+              <w:bottom w:type="dxa" w:w="70"/>
+              <w:right w:type="dxa" w:w="100"/>
+            </w:tcMar>
+          </w:tcPr>
+          <w:p>
+            <w:pPr>
+              <w:jc w:val="center"/>
+            </w:pPr>
+            <w:r>
+              <w:rPr>
+                <w:rFonts w:ascii="Arial" w:cs="Arial" w:eastAsia="Arial" w:hAnsi="Arial"/>
+                <w:sz w:val="20"/>
+                <w:szCs w:val="20"/>
+              </w:rPr>
+              <w:t xml:space="preserve">0.282 ± 0.016</w:t>
+            </w:r>
+          </w:p>
+        </w:tc>
+        <w:tc>
+          <w:tcPr>
+            <w:tcW w:type="dxa" w:w="1000"/>
+            <w:tcBorders>
+              <w:top w:val="single" w:color="AAAAAA" w:sz="1"/>
+              <w:left w:val="single" w:color="AAAAAA" w:sz="1"/>
+              <w:bottom w:val="single" w:color="AAAAAA" w:sz="1"/>
+              <w:right w:val="single" w:color="AAAAAA" w:sz="1"/>
+            </w:tcBorders>
+            <w:tcMar>
+              <w:top w:type="dxa" w:w="70"/>
+              <w:left w:type="dxa" w:w="100"/>
+              <w:bottom w:type="dxa" w:w="70"/>
+              <w:right w:type="dxa" w:w="100"/>
+            </w:tcMar>
+          </w:tcPr>
+          <w:p>
+            <w:pPr>
+              <w:jc w:val="center"/>
+            </w:pPr>
+            <w:r>
+              <w:rPr>
+                <w:rFonts w:ascii="Arial" w:cs="Arial" w:eastAsia="Arial" w:hAnsi="Arial"/>
+                <w:sz w:val="20"/>
+                <w:szCs w:val="20"/>
+              </w:rPr>
+              <w:t xml:space="preserve">0.123 ± 0.027</w:t>
+            </w:r>
+          </w:p>
+        </w:tc>
+        <w:tc>
+          <w:tcPr>
             <w:tcW w:type="dxa" w:w="1100"/>
             <w:tcBorders>
               <w:top w:val="single" w:color="AAAAAA" w:sz="1"/>
@@ -4315,187 +5096,127 @@
                 <w:sz w:val="20"/>
                 <w:szCs w:val="20"/>
               </w:rPr>
-              <w:t xml:space="preserve">0.282 ± 0.016</w:t>
-            </w:r>
-          </w:p>
-        </w:tc>
-        <w:tc>
-          <w:tcPr>
-            <w:tcW w:type="dxa" w:w="1000"/>
-            <w:tcBorders>
-              <w:top w:val="single" w:color="AAAAAA" w:sz="1"/>
-              <w:left w:val="single" w:color="AAAAAA" w:sz="1"/>
-              <w:bottom w:val="single" w:color="AAAAAA" w:sz="1"/>
-              <w:right w:val="single" w:color="AAAAAA" w:sz="1"/>
-            </w:tcBorders>
-            <w:tcMar>
-              <w:top w:type="dxa" w:w="70"/>
-              <w:left w:type="dxa" w:w="100"/>
-              <w:bottom w:type="dxa" w:w="70"/>
-              <w:right w:type="dxa" w:w="100"/>
-            </w:tcMar>
-          </w:tcPr>
-          <w:p>
-            <w:pPr>
-              <w:jc w:val="center"/>
-            </w:pPr>
-            <w:r>
-              <w:rPr>
-                <w:rFonts w:ascii="Arial" w:cs="Arial" w:eastAsia="Arial" w:hAnsi="Arial"/>
-                <w:sz w:val="20"/>
-                <w:szCs w:val="20"/>
-              </w:rPr>
-              <w:t xml:space="preserve">0.123 ± 0.027</w:t>
-            </w:r>
-          </w:p>
-        </w:tc>
-        <w:tc>
-          <w:tcPr>
-            <w:tcW w:type="dxa" w:w="800"/>
-            <w:tcBorders>
-              <w:top w:val="single" w:color="AAAAAA" w:sz="1"/>
-              <w:left w:val="single" w:color="AAAAAA" w:sz="1"/>
-              <w:bottom w:val="single" w:color="AAAAAA" w:sz="1"/>
-              <w:right w:val="single" w:color="AAAAAA" w:sz="1"/>
-            </w:tcBorders>
-            <w:tcMar>
-              <w:top w:type="dxa" w:w="70"/>
-              <w:left w:type="dxa" w:w="100"/>
-              <w:bottom w:type="dxa" w:w="70"/>
-              <w:right w:type="dxa" w:w="100"/>
-            </w:tcMar>
-          </w:tcPr>
-          <w:p>
-            <w:pPr>
-              <w:jc w:val="center"/>
-            </w:pPr>
-            <w:r>
-              <w:rPr>
-                <w:rFonts w:ascii="Arial" w:cs="Arial" w:eastAsia="Arial" w:hAnsi="Arial"/>
-                <w:sz w:val="20"/>
-                <w:szCs w:val="20"/>
-              </w:rPr>
-              <w:t xml:space="preserve">0.383</w:t>
-            </w:r>
-          </w:p>
-        </w:tc>
-        <w:tc>
-          <w:tcPr>
-            <w:tcW w:type="dxa" w:w="800"/>
-            <w:tcBorders>
-              <w:top w:val="single" w:color="AAAAAA" w:sz="1"/>
-              <w:left w:val="single" w:color="AAAAAA" w:sz="1"/>
-              <w:bottom w:val="single" w:color="AAAAAA" w:sz="1"/>
-              <w:right w:val="single" w:color="AAAAAA" w:sz="1"/>
-            </w:tcBorders>
-            <w:tcMar>
-              <w:top w:type="dxa" w:w="70"/>
-              <w:left w:type="dxa" w:w="100"/>
-              <w:bottom w:type="dxa" w:w="70"/>
-              <w:right w:type="dxa" w:w="100"/>
-            </w:tcMar>
-          </w:tcPr>
-          <w:p>
-            <w:pPr>
-              <w:jc w:val="center"/>
-            </w:pPr>
-            <w:r>
-              <w:rPr>
-                <w:rFonts w:ascii="Arial" w:cs="Arial" w:eastAsia="Arial" w:hAnsi="Arial"/>
-                <w:sz w:val="20"/>
-                <w:szCs w:val="20"/>
-              </w:rPr>
-              <w:t xml:space="preserve">0.017</w:t>
-            </w:r>
-          </w:p>
-        </w:tc>
-        <w:tc>
-          <w:tcPr>
-            <w:tcW w:type="dxa" w:w="800"/>
-            <w:tcBorders>
-              <w:top w:val="single" w:color="AAAAAA" w:sz="1"/>
-              <w:left w:val="single" w:color="AAAAAA" w:sz="1"/>
-              <w:bottom w:val="single" w:color="AAAAAA" w:sz="1"/>
-              <w:right w:val="single" w:color="AAAAAA" w:sz="1"/>
-            </w:tcBorders>
-            <w:tcMar>
-              <w:top w:type="dxa" w:w="70"/>
-              <w:left w:type="dxa" w:w="100"/>
-              <w:bottom w:type="dxa" w:w="70"/>
-              <w:right w:type="dxa" w:w="100"/>
-            </w:tcMar>
-          </w:tcPr>
-          <w:p>
-            <w:pPr>
-              <w:jc w:val="center"/>
-            </w:pPr>
-            <w:r>
-              <w:rPr>
-                <w:rFonts w:ascii="Arial" w:cs="Arial" w:eastAsia="Arial" w:hAnsi="Arial"/>
-                <w:sz w:val="20"/>
-                <w:szCs w:val="20"/>
-              </w:rPr>
-              <w:t xml:space="preserve">0.375</w:t>
-            </w:r>
-          </w:p>
-        </w:tc>
-        <w:tc>
-          <w:tcPr>
-            <w:tcW w:type="dxa" w:w="800"/>
-            <w:tcBorders>
-              <w:top w:val="single" w:color="AAAAAA" w:sz="1"/>
-              <w:left w:val="single" w:color="AAAAAA" w:sz="1"/>
-              <w:bottom w:val="single" w:color="AAAAAA" w:sz="1"/>
-              <w:right w:val="single" w:color="AAAAAA" w:sz="1"/>
-            </w:tcBorders>
-            <w:tcMar>
-              <w:top w:type="dxa" w:w="70"/>
-              <w:left w:type="dxa" w:w="100"/>
-              <w:bottom w:type="dxa" w:w="70"/>
-              <w:right w:type="dxa" w:w="100"/>
-            </w:tcMar>
-          </w:tcPr>
-          <w:p>
-            <w:pPr>
-              <w:jc w:val="center"/>
-            </w:pPr>
-            <w:r>
-              <w:rPr>
-                <w:rFonts w:ascii="Arial" w:cs="Arial" w:eastAsia="Arial" w:hAnsi="Arial"/>
-                <w:sz w:val="20"/>
-                <w:szCs w:val="20"/>
-              </w:rPr>
-              <w:t xml:space="preserve">0.134</w:t>
-            </w:r>
-          </w:p>
-        </w:tc>
-        <w:tc>
-          <w:tcPr>
-            <w:tcW w:type="dxa" w:w="860"/>
-            <w:tcBorders>
-              <w:top w:val="single" w:color="AAAAAA" w:sz="1"/>
-              <w:left w:val="single" w:color="AAAAAA" w:sz="1"/>
-              <w:bottom w:val="single" w:color="AAAAAA" w:sz="1"/>
-              <w:right w:val="single" w:color="AAAAAA" w:sz="1"/>
-            </w:tcBorders>
-            <w:tcMar>
-              <w:top w:type="dxa" w:w="70"/>
-              <w:left w:type="dxa" w:w="100"/>
-              <w:bottom w:type="dxa" w:w="70"/>
-              <w:right w:type="dxa" w:w="100"/>
-            </w:tcMar>
-          </w:tcPr>
-          <w:p>
-            <w:pPr>
-              <w:jc w:val="center"/>
-            </w:pPr>
-            <w:r>
-              <w:rPr>
-                <w:rFonts w:ascii="Arial" w:cs="Arial" w:eastAsia="Arial" w:hAnsi="Arial"/>
-                <w:sz w:val="20"/>
-                <w:szCs w:val="20"/>
-              </w:rPr>
-              <w:t xml:space="preserve">0.049</w:t>
+              <w:t xml:space="preserve">0.383 ± 0.018</w:t>
+            </w:r>
+          </w:p>
+        </w:tc>
+        <w:tc>
+          <w:tcPr>
+            <w:tcW w:type="dxa" w:w="1100"/>
+            <w:tcBorders>
+              <w:top w:val="single" w:color="AAAAAA" w:sz="1"/>
+              <w:left w:val="single" w:color="AAAAAA" w:sz="1"/>
+              <w:bottom w:val="single" w:color="AAAAAA" w:sz="1"/>
+              <w:right w:val="single" w:color="AAAAAA" w:sz="1"/>
+            </w:tcBorders>
+            <w:tcMar>
+              <w:top w:type="dxa" w:w="70"/>
+              <w:left w:type="dxa" w:w="100"/>
+              <w:bottom w:type="dxa" w:w="70"/>
+              <w:right w:type="dxa" w:w="100"/>
+            </w:tcMar>
+          </w:tcPr>
+          <w:p>
+            <w:pPr>
+              <w:jc w:val="center"/>
+            </w:pPr>
+            <w:r>
+              <w:rPr>
+                <w:rFonts w:ascii="Arial" w:cs="Arial" w:eastAsia="Arial" w:hAnsi="Arial"/>
+                <w:sz w:val="20"/>
+                <w:szCs w:val="20"/>
+              </w:rPr>
+              <w:t xml:space="preserve">0.017 ± 0.029</w:t>
+            </w:r>
+          </w:p>
+        </w:tc>
+        <w:tc>
+          <w:tcPr>
+            <w:tcW w:type="dxa" w:w="1100"/>
+            <w:tcBorders>
+              <w:top w:val="single" w:color="AAAAAA" w:sz="1"/>
+              <w:left w:val="single" w:color="AAAAAA" w:sz="1"/>
+              <w:bottom w:val="single" w:color="AAAAAA" w:sz="1"/>
+              <w:right w:val="single" w:color="AAAAAA" w:sz="1"/>
+            </w:tcBorders>
+            <w:tcMar>
+              <w:top w:type="dxa" w:w="70"/>
+              <w:left w:type="dxa" w:w="100"/>
+              <w:bottom w:type="dxa" w:w="70"/>
+              <w:right w:type="dxa" w:w="100"/>
+            </w:tcMar>
+          </w:tcPr>
+          <w:p>
+            <w:pPr>
+              <w:jc w:val="center"/>
+            </w:pPr>
+            <w:r>
+              <w:rPr>
+                <w:rFonts w:ascii="Arial" w:cs="Arial" w:eastAsia="Arial" w:hAnsi="Arial"/>
+                <w:sz w:val="20"/>
+                <w:szCs w:val="20"/>
+              </w:rPr>
+              <w:t xml:space="preserve">0.375 ± 0.191</w:t>
+            </w:r>
+          </w:p>
+        </w:tc>
+        <w:tc>
+          <w:tcPr>
+            <w:tcW w:type="dxa" w:w="1100"/>
+            <w:tcBorders>
+              <w:top w:val="single" w:color="AAAAAA" w:sz="1"/>
+              <w:left w:val="single" w:color="AAAAAA" w:sz="1"/>
+              <w:bottom w:val="single" w:color="AAAAAA" w:sz="1"/>
+              <w:right w:val="single" w:color="AAAAAA" w:sz="1"/>
+            </w:tcBorders>
+            <w:tcMar>
+              <w:top w:type="dxa" w:w="70"/>
+              <w:left w:type="dxa" w:w="100"/>
+              <w:bottom w:type="dxa" w:w="70"/>
+              <w:right w:type="dxa" w:w="100"/>
+            </w:tcMar>
+          </w:tcPr>
+          <w:p>
+            <w:pPr>
+              <w:jc w:val="center"/>
+            </w:pPr>
+            <w:r>
+              <w:rPr>
+                <w:rFonts w:ascii="Arial" w:cs="Arial" w:eastAsia="Arial" w:hAnsi="Arial"/>
+                <w:sz w:val="20"/>
+                <w:szCs w:val="20"/>
+              </w:rPr>
+              <w:t xml:space="preserve">0.134 ± 0.196</w:t>
+            </w:r>
+          </w:p>
+        </w:tc>
+        <w:tc>
+          <w:tcPr>
+            <w:tcW w:type="dxa" w:w="1100"/>
+            <w:tcBorders>
+              <w:top w:val="single" w:color="AAAAAA" w:sz="1"/>
+              <w:left w:val="single" w:color="AAAAAA" w:sz="1"/>
+              <w:bottom w:val="single" w:color="AAAAAA" w:sz="1"/>
+              <w:right w:val="single" w:color="AAAAAA" w:sz="1"/>
+            </w:tcBorders>
+            <w:tcMar>
+              <w:top w:type="dxa" w:w="70"/>
+              <w:left w:type="dxa" w:w="100"/>
+              <w:bottom w:type="dxa" w:w="70"/>
+              <w:right w:type="dxa" w:w="100"/>
+            </w:tcMar>
+          </w:tcPr>
+          <w:p>
+            <w:pPr>
+              <w:jc w:val="center"/>
+            </w:pPr>
+            <w:r>
+              <w:rPr>
+                <w:rFonts w:ascii="Arial" w:cs="Arial" w:eastAsia="Arial" w:hAnsi="Arial"/>
+                <w:sz w:val="20"/>
+                <w:szCs w:val="20"/>
+              </w:rPr>
+              <w:t xml:space="preserve">0.049 ± 0.082</w:t>
             </w:r>
           </w:p>
         </w:tc>
@@ -4563,6 +5284,66 @@
         </w:tc>
         <w:tc>
           <w:tcPr>
+            <w:tcW w:type="dxa" w:w="1300"/>
+            <w:tcBorders>
+              <w:top w:val="single" w:color="AAAAAA" w:sz="1"/>
+              <w:left w:val="single" w:color="AAAAAA" w:sz="1"/>
+              <w:bottom w:val="single" w:color="AAAAAA" w:sz="1"/>
+              <w:right w:val="single" w:color="AAAAAA" w:sz="1"/>
+            </w:tcBorders>
+            <w:tcMar>
+              <w:top w:type="dxa" w:w="70"/>
+              <w:left w:type="dxa" w:w="100"/>
+              <w:bottom w:type="dxa" w:w="70"/>
+              <w:right w:type="dxa" w:w="100"/>
+            </w:tcMar>
+          </w:tcPr>
+          <w:p>
+            <w:pPr>
+              <w:jc w:val="center"/>
+            </w:pPr>
+            <w:r>
+              <w:rPr>
+                <w:rFonts w:ascii="Arial" w:cs="Arial" w:eastAsia="Arial" w:hAnsi="Arial"/>
+                <w:sz w:val="20"/>
+                <w:szCs w:val="20"/>
+              </w:rPr>
+              <w:t xml:space="preserve">0.497 ± 0.016</w:t>
+            </w:r>
+          </w:p>
+        </w:tc>
+        <w:tc>
+          <w:tcPr>
+            <w:tcW w:type="dxa" w:w="1000"/>
+            <w:tcBorders>
+              <w:top w:val="single" w:color="AAAAAA" w:sz="1"/>
+              <w:left w:val="single" w:color="AAAAAA" w:sz="1"/>
+              <w:bottom w:val="single" w:color="AAAAAA" w:sz="1"/>
+              <w:right w:val="single" w:color="AAAAAA" w:sz="1"/>
+            </w:tcBorders>
+            <w:tcMar>
+              <w:top w:type="dxa" w:w="70"/>
+              <w:left w:type="dxa" w:w="100"/>
+              <w:bottom w:type="dxa" w:w="70"/>
+              <w:right w:type="dxa" w:w="100"/>
+            </w:tcMar>
+          </w:tcPr>
+          <w:p>
+            <w:pPr>
+              <w:jc w:val="center"/>
+            </w:pPr>
+            <w:r>
+              <w:rPr>
+                <w:rFonts w:ascii="Arial" w:cs="Arial" w:eastAsia="Arial" w:hAnsi="Arial"/>
+                <w:sz w:val="20"/>
+                <w:szCs w:val="20"/>
+              </w:rPr>
+              <w:t xml:space="preserve">0.466 ± 0.033</w:t>
+            </w:r>
+          </w:p>
+        </w:tc>
+        <w:tc>
+          <w:tcPr>
             <w:tcW w:type="dxa" w:w="1100"/>
             <w:tcBorders>
               <w:top w:val="single" w:color="AAAAAA" w:sz="1"/>
@@ -4587,187 +5368,127 @@
                 <w:sz w:val="20"/>
                 <w:szCs w:val="20"/>
               </w:rPr>
-              <w:t xml:space="preserve">0.497 ± 0.016</w:t>
-            </w:r>
-          </w:p>
-        </w:tc>
-        <w:tc>
-          <w:tcPr>
-            <w:tcW w:type="dxa" w:w="1000"/>
-            <w:tcBorders>
-              <w:top w:val="single" w:color="AAAAAA" w:sz="1"/>
-              <w:left w:val="single" w:color="AAAAAA" w:sz="1"/>
-              <w:bottom w:val="single" w:color="AAAAAA" w:sz="1"/>
-              <w:right w:val="single" w:color="AAAAAA" w:sz="1"/>
-            </w:tcBorders>
-            <w:tcMar>
-              <w:top w:type="dxa" w:w="70"/>
-              <w:left w:type="dxa" w:w="100"/>
-              <w:bottom w:type="dxa" w:w="70"/>
-              <w:right w:type="dxa" w:w="100"/>
-            </w:tcMar>
-          </w:tcPr>
-          <w:p>
-            <w:pPr>
-              <w:jc w:val="center"/>
-            </w:pPr>
-            <w:r>
-              <w:rPr>
-                <w:rFonts w:ascii="Arial" w:cs="Arial" w:eastAsia="Arial" w:hAnsi="Arial"/>
-                <w:sz w:val="20"/>
-                <w:szCs w:val="20"/>
-              </w:rPr>
-              <w:t xml:space="preserve">0.466 ± 0.033</w:t>
-            </w:r>
-          </w:p>
-        </w:tc>
-        <w:tc>
-          <w:tcPr>
-            <w:tcW w:type="dxa" w:w="800"/>
-            <w:tcBorders>
-              <w:top w:val="single" w:color="AAAAAA" w:sz="1"/>
-              <w:left w:val="single" w:color="AAAAAA" w:sz="1"/>
-              <w:bottom w:val="single" w:color="AAAAAA" w:sz="1"/>
-              <w:right w:val="single" w:color="AAAAAA" w:sz="1"/>
-            </w:tcBorders>
-            <w:tcMar>
-              <w:top w:type="dxa" w:w="70"/>
-              <w:left w:type="dxa" w:w="100"/>
-              <w:bottom w:type="dxa" w:w="70"/>
-              <w:right w:type="dxa" w:w="100"/>
-            </w:tcMar>
-          </w:tcPr>
-          <w:p>
-            <w:pPr>
-              <w:jc w:val="center"/>
-            </w:pPr>
-            <w:r>
-              <w:rPr>
-                <w:rFonts w:ascii="Arial" w:cs="Arial" w:eastAsia="Arial" w:hAnsi="Arial"/>
-                <w:sz w:val="20"/>
-                <w:szCs w:val="20"/>
-              </w:rPr>
-              <w:t xml:space="preserve">0.654</w:t>
-            </w:r>
-          </w:p>
-        </w:tc>
-        <w:tc>
-          <w:tcPr>
-            <w:tcW w:type="dxa" w:w="800"/>
-            <w:tcBorders>
-              <w:top w:val="single" w:color="AAAAAA" w:sz="1"/>
-              <w:left w:val="single" w:color="AAAAAA" w:sz="1"/>
-              <w:bottom w:val="single" w:color="AAAAAA" w:sz="1"/>
-              <w:right w:val="single" w:color="AAAAAA" w:sz="1"/>
-            </w:tcBorders>
-            <w:tcMar>
-              <w:top w:type="dxa" w:w="70"/>
-              <w:left w:type="dxa" w:w="100"/>
-              <w:bottom w:type="dxa" w:w="70"/>
-              <w:right w:type="dxa" w:w="100"/>
-            </w:tcMar>
-          </w:tcPr>
-          <w:p>
-            <w:pPr>
-              <w:jc w:val="center"/>
-            </w:pPr>
-            <w:r>
-              <w:rPr>
-                <w:rFonts w:ascii="Arial" w:cs="Arial" w:eastAsia="Arial" w:hAnsi="Arial"/>
-                <w:sz w:val="20"/>
-                <w:szCs w:val="20"/>
-              </w:rPr>
-              <w:t xml:space="preserve">0.076</w:t>
-            </w:r>
-          </w:p>
-        </w:tc>
-        <w:tc>
-          <w:tcPr>
-            <w:tcW w:type="dxa" w:w="800"/>
-            <w:tcBorders>
-              <w:top w:val="single" w:color="AAAAAA" w:sz="1"/>
-              <w:left w:val="single" w:color="AAAAAA" w:sz="1"/>
-              <w:bottom w:val="single" w:color="AAAAAA" w:sz="1"/>
-              <w:right w:val="single" w:color="AAAAAA" w:sz="1"/>
-            </w:tcBorders>
-            <w:tcMar>
-              <w:top w:type="dxa" w:w="70"/>
-              <w:left w:type="dxa" w:w="100"/>
-              <w:bottom w:type="dxa" w:w="70"/>
-              <w:right w:type="dxa" w:w="100"/>
-            </w:tcMar>
-          </w:tcPr>
-          <w:p>
-            <w:pPr>
-              <w:jc w:val="center"/>
-            </w:pPr>
-            <w:r>
-              <w:rPr>
-                <w:rFonts w:ascii="Arial" w:cs="Arial" w:eastAsia="Arial" w:hAnsi="Arial"/>
-                <w:sz w:val="20"/>
-                <w:szCs w:val="20"/>
-              </w:rPr>
-              <w:t xml:space="preserve">0.700</w:t>
-            </w:r>
-          </w:p>
-        </w:tc>
-        <w:tc>
-          <w:tcPr>
-            <w:tcW w:type="dxa" w:w="800"/>
-            <w:tcBorders>
-              <w:top w:val="single" w:color="AAAAAA" w:sz="1"/>
-              <w:left w:val="single" w:color="AAAAAA" w:sz="1"/>
-              <w:bottom w:val="single" w:color="AAAAAA" w:sz="1"/>
-              <w:right w:val="single" w:color="AAAAAA" w:sz="1"/>
-            </w:tcBorders>
-            <w:tcMar>
-              <w:top w:type="dxa" w:w="70"/>
-              <w:left w:type="dxa" w:w="100"/>
-              <w:bottom w:type="dxa" w:w="70"/>
-              <w:right w:type="dxa" w:w="100"/>
-            </w:tcMar>
-          </w:tcPr>
-          <w:p>
-            <w:pPr>
-              <w:jc w:val="center"/>
-            </w:pPr>
-            <w:r>
-              <w:rPr>
-                <w:rFonts w:ascii="Arial" w:cs="Arial" w:eastAsia="Arial" w:hAnsi="Arial"/>
-                <w:sz w:val="20"/>
-                <w:szCs w:val="20"/>
-              </w:rPr>
-              <w:t xml:space="preserve">0.362</w:t>
-            </w:r>
-          </w:p>
-        </w:tc>
-        <w:tc>
-          <w:tcPr>
-            <w:tcW w:type="dxa" w:w="860"/>
-            <w:tcBorders>
-              <w:top w:val="single" w:color="AAAAAA" w:sz="1"/>
-              <w:left w:val="single" w:color="AAAAAA" w:sz="1"/>
-              <w:bottom w:val="single" w:color="AAAAAA" w:sz="1"/>
-              <w:right w:val="single" w:color="AAAAAA" w:sz="1"/>
-            </w:tcBorders>
-            <w:tcMar>
-              <w:top w:type="dxa" w:w="70"/>
-              <w:left w:type="dxa" w:w="100"/>
-              <w:bottom w:type="dxa" w:w="70"/>
-              <w:right w:type="dxa" w:w="100"/>
-            </w:tcMar>
-          </w:tcPr>
-          <w:p>
-            <w:pPr>
-              <w:jc w:val="center"/>
-            </w:pPr>
-            <w:r>
-              <w:rPr>
-                <w:rFonts w:ascii="Arial" w:cs="Arial" w:eastAsia="Arial" w:hAnsi="Arial"/>
-                <w:sz w:val="20"/>
-                <w:szCs w:val="20"/>
-              </w:rPr>
-              <w:t xml:space="preserve">0.659</w:t>
+              <w:t xml:space="preserve">0.654 ± 0.032</w:t>
+            </w:r>
+          </w:p>
+        </w:tc>
+        <w:tc>
+          <w:tcPr>
+            <w:tcW w:type="dxa" w:w="1100"/>
+            <w:tcBorders>
+              <w:top w:val="single" w:color="AAAAAA" w:sz="1"/>
+              <w:left w:val="single" w:color="AAAAAA" w:sz="1"/>
+              <w:bottom w:val="single" w:color="AAAAAA" w:sz="1"/>
+              <w:right w:val="single" w:color="AAAAAA" w:sz="1"/>
+            </w:tcBorders>
+            <w:tcMar>
+              <w:top w:type="dxa" w:w="70"/>
+              <w:left w:type="dxa" w:w="100"/>
+              <w:bottom w:type="dxa" w:w="70"/>
+              <w:right w:type="dxa" w:w="100"/>
+            </w:tcMar>
+          </w:tcPr>
+          <w:p>
+            <w:pPr>
+              <w:jc w:val="center"/>
+            </w:pPr>
+            <w:r>
+              <w:rPr>
+                <w:rFonts w:ascii="Arial" w:cs="Arial" w:eastAsia="Arial" w:hAnsi="Arial"/>
+                <w:sz w:val="20"/>
+                <w:szCs w:val="20"/>
+              </w:rPr>
+              <w:t xml:space="preserve">0.076 ± 0.014</w:t>
+            </w:r>
+          </w:p>
+        </w:tc>
+        <w:tc>
+          <w:tcPr>
+            <w:tcW w:type="dxa" w:w="1100"/>
+            <w:tcBorders>
+              <w:top w:val="single" w:color="AAAAAA" w:sz="1"/>
+              <w:left w:val="single" w:color="AAAAAA" w:sz="1"/>
+              <w:bottom w:val="single" w:color="AAAAAA" w:sz="1"/>
+              <w:right w:val="single" w:color="AAAAAA" w:sz="1"/>
+            </w:tcBorders>
+            <w:tcMar>
+              <w:top w:type="dxa" w:w="70"/>
+              <w:left w:type="dxa" w:w="100"/>
+              <w:bottom w:type="dxa" w:w="70"/>
+              <w:right w:type="dxa" w:w="100"/>
+            </w:tcMar>
+          </w:tcPr>
+          <w:p>
+            <w:pPr>
+              <w:jc w:val="center"/>
+            </w:pPr>
+            <w:r>
+              <w:rPr>
+                <w:rFonts w:ascii="Arial" w:cs="Arial" w:eastAsia="Arial" w:hAnsi="Arial"/>
+                <w:sz w:val="20"/>
+                <w:szCs w:val="20"/>
+              </w:rPr>
+              <w:t xml:space="preserve">0.700 ± 0.043</w:t>
+            </w:r>
+          </w:p>
+        </w:tc>
+        <w:tc>
+          <w:tcPr>
+            <w:tcW w:type="dxa" w:w="1100"/>
+            <w:tcBorders>
+              <w:top w:val="single" w:color="AAAAAA" w:sz="1"/>
+              <w:left w:val="single" w:color="AAAAAA" w:sz="1"/>
+              <w:bottom w:val="single" w:color="AAAAAA" w:sz="1"/>
+              <w:right w:val="single" w:color="AAAAAA" w:sz="1"/>
+            </w:tcBorders>
+            <w:tcMar>
+              <w:top w:type="dxa" w:w="70"/>
+              <w:left w:type="dxa" w:w="100"/>
+              <w:bottom w:type="dxa" w:w="70"/>
+              <w:right w:type="dxa" w:w="100"/>
+            </w:tcMar>
+          </w:tcPr>
+          <w:p>
+            <w:pPr>
+              <w:jc w:val="center"/>
+            </w:pPr>
+            <w:r>
+              <w:rPr>
+                <w:rFonts w:ascii="Arial" w:cs="Arial" w:eastAsia="Arial" w:hAnsi="Arial"/>
+                <w:sz w:val="20"/>
+                <w:szCs w:val="20"/>
+              </w:rPr>
+              <w:t xml:space="preserve">0.362 ± 0.072</w:t>
+            </w:r>
+          </w:p>
+        </w:tc>
+        <w:tc>
+          <w:tcPr>
+            <w:tcW w:type="dxa" w:w="1100"/>
+            <w:tcBorders>
+              <w:top w:val="single" w:color="AAAAAA" w:sz="1"/>
+              <w:left w:val="single" w:color="AAAAAA" w:sz="1"/>
+              <w:bottom w:val="single" w:color="AAAAAA" w:sz="1"/>
+              <w:right w:val="single" w:color="AAAAAA" w:sz="1"/>
+            </w:tcBorders>
+            <w:tcMar>
+              <w:top w:type="dxa" w:w="70"/>
+              <w:left w:type="dxa" w:w="100"/>
+              <w:bottom w:type="dxa" w:w="70"/>
+              <w:right w:type="dxa" w:w="100"/>
+            </w:tcMar>
+          </w:tcPr>
+          <w:p>
+            <w:pPr>
+              <w:jc w:val="center"/>
+            </w:pPr>
+            <w:r>
+              <w:rPr>
+                <w:rFonts w:ascii="Arial" w:cs="Arial" w:eastAsia="Arial" w:hAnsi="Arial"/>
+                <w:sz w:val="20"/>
+                <w:szCs w:val="20"/>
+              </w:rPr>
+              <w:t xml:space="preserve">0.659 ± 0.026</w:t>
             </w:r>
           </w:p>
         </w:tc>
@@ -4835,6 +5556,66 @@
         </w:tc>
         <w:tc>
           <w:tcPr>
+            <w:tcW w:type="dxa" w:w="1300"/>
+            <w:tcBorders>
+              <w:top w:val="single" w:color="AAAAAA" w:sz="1"/>
+              <w:left w:val="single" w:color="AAAAAA" w:sz="1"/>
+              <w:bottom w:val="single" w:color="AAAAAA" w:sz="1"/>
+              <w:right w:val="single" w:color="AAAAAA" w:sz="1"/>
+            </w:tcBorders>
+            <w:tcMar>
+              <w:top w:type="dxa" w:w="70"/>
+              <w:left w:type="dxa" w:w="100"/>
+              <w:bottom w:type="dxa" w:w="70"/>
+              <w:right w:type="dxa" w:w="100"/>
+            </w:tcMar>
+          </w:tcPr>
+          <w:p>
+            <w:pPr>
+              <w:jc w:val="center"/>
+            </w:pPr>
+            <w:r>
+              <w:rPr>
+                <w:rFonts w:ascii="Arial" w:cs="Arial" w:eastAsia="Arial" w:hAnsi="Arial"/>
+                <w:sz w:val="20"/>
+                <w:szCs w:val="20"/>
+              </w:rPr>
+              <w:t xml:space="preserve">0.487 ± 0.007</w:t>
+            </w:r>
+          </w:p>
+        </w:tc>
+        <w:tc>
+          <w:tcPr>
+            <w:tcW w:type="dxa" w:w="1000"/>
+            <w:tcBorders>
+              <w:top w:val="single" w:color="AAAAAA" w:sz="1"/>
+              <w:left w:val="single" w:color="AAAAAA" w:sz="1"/>
+              <w:bottom w:val="single" w:color="AAAAAA" w:sz="1"/>
+              <w:right w:val="single" w:color="AAAAAA" w:sz="1"/>
+            </w:tcBorders>
+            <w:tcMar>
+              <w:top w:type="dxa" w:w="70"/>
+              <w:left w:type="dxa" w:w="100"/>
+              <w:bottom w:type="dxa" w:w="70"/>
+              <w:right w:type="dxa" w:w="100"/>
+            </w:tcMar>
+          </w:tcPr>
+          <w:p>
+            <w:pPr>
+              <w:jc w:val="center"/>
+            </w:pPr>
+            <w:r>
+              <w:rPr>
+                <w:rFonts w:ascii="Arial" w:cs="Arial" w:eastAsia="Arial" w:hAnsi="Arial"/>
+                <w:sz w:val="20"/>
+                <w:szCs w:val="20"/>
+              </w:rPr>
+              <w:t xml:space="preserve">0.445 ± 0.019</w:t>
+            </w:r>
+          </w:p>
+        </w:tc>
+        <w:tc>
+          <w:tcPr>
             <w:tcW w:type="dxa" w:w="1100"/>
             <w:tcBorders>
               <w:top w:val="single" w:color="AAAAAA" w:sz="1"/>
@@ -4859,187 +5640,127 @@
                 <w:sz w:val="20"/>
                 <w:szCs w:val="20"/>
               </w:rPr>
-              <w:t xml:space="preserve">0.487 ± 0.007</w:t>
-            </w:r>
-          </w:p>
-        </w:tc>
-        <w:tc>
-          <w:tcPr>
-            <w:tcW w:type="dxa" w:w="1000"/>
-            <w:tcBorders>
-              <w:top w:val="single" w:color="AAAAAA" w:sz="1"/>
-              <w:left w:val="single" w:color="AAAAAA" w:sz="1"/>
-              <w:bottom w:val="single" w:color="AAAAAA" w:sz="1"/>
-              <w:right w:val="single" w:color="AAAAAA" w:sz="1"/>
-            </w:tcBorders>
-            <w:tcMar>
-              <w:top w:type="dxa" w:w="70"/>
-              <w:left w:type="dxa" w:w="100"/>
-              <w:bottom w:type="dxa" w:w="70"/>
-              <w:right w:type="dxa" w:w="100"/>
-            </w:tcMar>
-          </w:tcPr>
-          <w:p>
-            <w:pPr>
-              <w:jc w:val="center"/>
-            </w:pPr>
-            <w:r>
-              <w:rPr>
-                <w:rFonts w:ascii="Arial" w:cs="Arial" w:eastAsia="Arial" w:hAnsi="Arial"/>
-                <w:sz w:val="20"/>
-                <w:szCs w:val="20"/>
-              </w:rPr>
-              <w:t xml:space="preserve">0.445 ± 0.019</w:t>
-            </w:r>
-          </w:p>
-        </w:tc>
-        <w:tc>
-          <w:tcPr>
-            <w:tcW w:type="dxa" w:w="800"/>
-            <w:tcBorders>
-              <w:top w:val="single" w:color="AAAAAA" w:sz="1"/>
-              <w:left w:val="single" w:color="AAAAAA" w:sz="1"/>
-              <w:bottom w:val="single" w:color="AAAAAA" w:sz="1"/>
-              <w:right w:val="single" w:color="AAAAAA" w:sz="1"/>
-            </w:tcBorders>
-            <w:tcMar>
-              <w:top w:type="dxa" w:w="70"/>
-              <w:left w:type="dxa" w:w="100"/>
-              <w:bottom w:type="dxa" w:w="70"/>
-              <w:right w:type="dxa" w:w="100"/>
-            </w:tcMar>
-          </w:tcPr>
-          <w:p>
-            <w:pPr>
-              <w:jc w:val="center"/>
-            </w:pPr>
-            <w:r>
-              <w:rPr>
-                <w:rFonts w:ascii="Arial" w:cs="Arial" w:eastAsia="Arial" w:hAnsi="Arial"/>
-                <w:sz w:val="20"/>
-                <w:szCs w:val="20"/>
-              </w:rPr>
-              <w:t xml:space="preserve">0.593</w:t>
-            </w:r>
-          </w:p>
-        </w:tc>
-        <w:tc>
-          <w:tcPr>
-            <w:tcW w:type="dxa" w:w="800"/>
-            <w:tcBorders>
-              <w:top w:val="single" w:color="AAAAAA" w:sz="1"/>
-              <w:left w:val="single" w:color="AAAAAA" w:sz="1"/>
-              <w:bottom w:val="single" w:color="AAAAAA" w:sz="1"/>
-              <w:right w:val="single" w:color="AAAAAA" w:sz="1"/>
-            </w:tcBorders>
-            <w:tcMar>
-              <w:top w:type="dxa" w:w="70"/>
-              <w:left w:type="dxa" w:w="100"/>
-              <w:bottom w:type="dxa" w:w="70"/>
-              <w:right w:type="dxa" w:w="100"/>
-            </w:tcMar>
-          </w:tcPr>
-          <w:p>
-            <w:pPr>
-              <w:jc w:val="center"/>
-            </w:pPr>
-            <w:r>
-              <w:rPr>
-                <w:rFonts w:ascii="Arial" w:cs="Arial" w:eastAsia="Arial" w:hAnsi="Arial"/>
-                <w:sz w:val="20"/>
-                <w:szCs w:val="20"/>
-              </w:rPr>
-              <w:t xml:space="preserve">0.091</w:t>
-            </w:r>
-          </w:p>
-        </w:tc>
-        <w:tc>
-          <w:tcPr>
-            <w:tcW w:type="dxa" w:w="800"/>
-            <w:tcBorders>
-              <w:top w:val="single" w:color="AAAAAA" w:sz="1"/>
-              <w:left w:val="single" w:color="AAAAAA" w:sz="1"/>
-              <w:bottom w:val="single" w:color="AAAAAA" w:sz="1"/>
-              <w:right w:val="single" w:color="AAAAAA" w:sz="1"/>
-            </w:tcBorders>
-            <w:tcMar>
-              <w:top w:type="dxa" w:w="70"/>
-              <w:left w:type="dxa" w:w="100"/>
-              <w:bottom w:type="dxa" w:w="70"/>
-              <w:right w:type="dxa" w:w="100"/>
-            </w:tcMar>
-          </w:tcPr>
-          <w:p>
-            <w:pPr>
-              <w:jc w:val="center"/>
-            </w:pPr>
-            <w:r>
-              <w:rPr>
-                <w:rFonts w:ascii="Arial" w:cs="Arial" w:eastAsia="Arial" w:hAnsi="Arial"/>
-                <w:sz w:val="20"/>
-                <w:szCs w:val="20"/>
-              </w:rPr>
-              <w:t xml:space="preserve">0.698</w:t>
-            </w:r>
-          </w:p>
-        </w:tc>
-        <w:tc>
-          <w:tcPr>
-            <w:tcW w:type="dxa" w:w="800"/>
-            <w:tcBorders>
-              <w:top w:val="single" w:color="AAAAAA" w:sz="1"/>
-              <w:left w:val="single" w:color="AAAAAA" w:sz="1"/>
-              <w:bottom w:val="single" w:color="AAAAAA" w:sz="1"/>
-              <w:right w:val="single" w:color="AAAAAA" w:sz="1"/>
-            </w:tcBorders>
-            <w:tcMar>
-              <w:top w:type="dxa" w:w="70"/>
-              <w:left w:type="dxa" w:w="100"/>
-              <w:bottom w:type="dxa" w:w="70"/>
-              <w:right w:type="dxa" w:w="100"/>
-            </w:tcMar>
-          </w:tcPr>
-          <w:p>
-            <w:pPr>
-              <w:jc w:val="center"/>
-            </w:pPr>
-            <w:r>
-              <w:rPr>
-                <w:rFonts w:ascii="Arial" w:cs="Arial" w:eastAsia="Arial" w:hAnsi="Arial"/>
-                <w:sz w:val="20"/>
-                <w:szCs w:val="20"/>
-              </w:rPr>
-              <w:t xml:space="preserve">0.447</w:t>
-            </w:r>
-          </w:p>
-        </w:tc>
-        <w:tc>
-          <w:tcPr>
-            <w:tcW w:type="dxa" w:w="860"/>
-            <w:tcBorders>
-              <w:top w:val="single" w:color="AAAAAA" w:sz="1"/>
-              <w:left w:val="single" w:color="AAAAAA" w:sz="1"/>
-              <w:bottom w:val="single" w:color="AAAAAA" w:sz="1"/>
-              <w:right w:val="single" w:color="AAAAAA" w:sz="1"/>
-            </w:tcBorders>
-            <w:tcMar>
-              <w:top w:type="dxa" w:w="70"/>
-              <w:left w:type="dxa" w:w="100"/>
-              <w:bottom w:type="dxa" w:w="70"/>
-              <w:right w:type="dxa" w:w="100"/>
-            </w:tcMar>
-          </w:tcPr>
-          <w:p>
-            <w:pPr>
-              <w:jc w:val="center"/>
-            </w:pPr>
-            <w:r>
-              <w:rPr>
-                <w:rFonts w:ascii="Arial" w:cs="Arial" w:eastAsia="Arial" w:hAnsi="Arial"/>
-                <w:sz w:val="20"/>
-                <w:szCs w:val="20"/>
-              </w:rPr>
-              <w:t xml:space="preserve">0.609</w:t>
+              <w:t xml:space="preserve">0.593 ± 0.022</w:t>
+            </w:r>
+          </w:p>
+        </w:tc>
+        <w:tc>
+          <w:tcPr>
+            <w:tcW w:type="dxa" w:w="1100"/>
+            <w:tcBorders>
+              <w:top w:val="single" w:color="AAAAAA" w:sz="1"/>
+              <w:left w:val="single" w:color="AAAAAA" w:sz="1"/>
+              <w:bottom w:val="single" w:color="AAAAAA" w:sz="1"/>
+              <w:right w:val="single" w:color="AAAAAA" w:sz="1"/>
+            </w:tcBorders>
+            <w:tcMar>
+              <w:top w:type="dxa" w:w="70"/>
+              <w:left w:type="dxa" w:w="100"/>
+              <w:bottom w:type="dxa" w:w="70"/>
+              <w:right w:type="dxa" w:w="100"/>
+            </w:tcMar>
+          </w:tcPr>
+          <w:p>
+            <w:pPr>
+              <w:jc w:val="center"/>
+            </w:pPr>
+            <w:r>
+              <w:rPr>
+                <w:rFonts w:ascii="Arial" w:cs="Arial" w:eastAsia="Arial" w:hAnsi="Arial"/>
+                <w:sz w:val="20"/>
+                <w:szCs w:val="20"/>
+              </w:rPr>
+              <w:t xml:space="preserve">0.091 ± 0.024</w:t>
+            </w:r>
+          </w:p>
+        </w:tc>
+        <w:tc>
+          <w:tcPr>
+            <w:tcW w:type="dxa" w:w="1100"/>
+            <w:tcBorders>
+              <w:top w:val="single" w:color="AAAAAA" w:sz="1"/>
+              <w:left w:val="single" w:color="AAAAAA" w:sz="1"/>
+              <w:bottom w:val="single" w:color="AAAAAA" w:sz="1"/>
+              <w:right w:val="single" w:color="AAAAAA" w:sz="1"/>
+            </w:tcBorders>
+            <w:tcMar>
+              <w:top w:type="dxa" w:w="70"/>
+              <w:left w:type="dxa" w:w="100"/>
+              <w:bottom w:type="dxa" w:w="70"/>
+              <w:right w:type="dxa" w:w="100"/>
+            </w:tcMar>
+          </w:tcPr>
+          <w:p>
+            <w:pPr>
+              <w:jc w:val="center"/>
+            </w:pPr>
+            <w:r>
+              <w:rPr>
+                <w:rFonts w:ascii="Arial" w:cs="Arial" w:eastAsia="Arial" w:hAnsi="Arial"/>
+                <w:sz w:val="20"/>
+                <w:szCs w:val="20"/>
+              </w:rPr>
+              <w:t xml:space="preserve">0.698 ± 0.009</w:t>
+            </w:r>
+          </w:p>
+        </w:tc>
+        <w:tc>
+          <w:tcPr>
+            <w:tcW w:type="dxa" w:w="1100"/>
+            <w:tcBorders>
+              <w:top w:val="single" w:color="AAAAAA" w:sz="1"/>
+              <w:left w:val="single" w:color="AAAAAA" w:sz="1"/>
+              <w:bottom w:val="single" w:color="AAAAAA" w:sz="1"/>
+              <w:right w:val="single" w:color="AAAAAA" w:sz="1"/>
+            </w:tcBorders>
+            <w:tcMar>
+              <w:top w:type="dxa" w:w="70"/>
+              <w:left w:type="dxa" w:w="100"/>
+              <w:bottom w:type="dxa" w:w="70"/>
+              <w:right w:type="dxa" w:w="100"/>
+            </w:tcMar>
+          </w:tcPr>
+          <w:p>
+            <w:pPr>
+              <w:jc w:val="center"/>
+            </w:pPr>
+            <w:r>
+              <w:rPr>
+                <w:rFonts w:ascii="Arial" w:cs="Arial" w:eastAsia="Arial" w:hAnsi="Arial"/>
+                <w:sz w:val="20"/>
+                <w:szCs w:val="20"/>
+              </w:rPr>
+              <w:t xml:space="preserve">0.447 ± 0.068</w:t>
+            </w:r>
+          </w:p>
+        </w:tc>
+        <w:tc>
+          <w:tcPr>
+            <w:tcW w:type="dxa" w:w="1100"/>
+            <w:tcBorders>
+              <w:top w:val="single" w:color="AAAAAA" w:sz="1"/>
+              <w:left w:val="single" w:color="AAAAAA" w:sz="1"/>
+              <w:bottom w:val="single" w:color="AAAAAA" w:sz="1"/>
+              <w:right w:val="single" w:color="AAAAAA" w:sz="1"/>
+            </w:tcBorders>
+            <w:tcMar>
+              <w:top w:type="dxa" w:w="70"/>
+              <w:left w:type="dxa" w:w="100"/>
+              <w:bottom w:type="dxa" w:w="70"/>
+              <w:right w:type="dxa" w:w="100"/>
+            </w:tcMar>
+          </w:tcPr>
+          <w:p>
+            <w:pPr>
+              <w:jc w:val="center"/>
+            </w:pPr>
+            <w:r>
+              <w:rPr>
+                <w:rFonts w:ascii="Arial" w:cs="Arial" w:eastAsia="Arial" w:hAnsi="Arial"/>
+                <w:sz w:val="20"/>
+                <w:szCs w:val="20"/>
+              </w:rPr>
+              <w:t xml:space="preserve">0.609 ± 0.007</w:t>
             </w:r>
           </w:p>
         </w:tc>
@@ -5109,6 +5830,68 @@
         </w:tc>
         <w:tc>
           <w:tcPr>
+            <w:tcW w:type="dxa" w:w="1300"/>
+            <w:tcBorders>
+              <w:top w:val="single" w:color="AAAAAA" w:sz="1"/>
+              <w:left w:val="single" w:color="AAAAAA" w:sz="1"/>
+              <w:bottom w:val="single" w:color="AAAAAA" w:sz="1"/>
+              <w:right w:val="single" w:color="AAAAAA" w:sz="1"/>
+            </w:tcBorders>
+            <w:shd w:fill="FFF2CC" w:val="clear"/>
+            <w:tcMar>
+              <w:top w:type="dxa" w:w="70"/>
+              <w:left w:type="dxa" w:w="100"/>
+              <w:bottom w:type="dxa" w:w="70"/>
+              <w:right w:type="dxa" w:w="100"/>
+            </w:tcMar>
+          </w:tcPr>
+          <w:p>
+            <w:pPr>
+              <w:jc w:val="center"/>
+            </w:pPr>
+            <w:r>
+              <w:rPr>
+                <w:rFonts w:ascii="Arial" w:cs="Arial" w:eastAsia="Arial" w:hAnsi="Arial"/>
+                <w:sz w:val="20"/>
+                <w:szCs w:val="20"/>
+              </w:rPr>
+              <w:t xml:space="preserve">0.526 ± 0.040</w:t>
+            </w:r>
+          </w:p>
+        </w:tc>
+        <w:tc>
+          <w:tcPr>
+            <w:tcW w:type="dxa" w:w="1000"/>
+            <w:tcBorders>
+              <w:top w:val="single" w:color="AAAAAA" w:sz="1"/>
+              <w:left w:val="single" w:color="AAAAAA" w:sz="1"/>
+              <w:bottom w:val="single" w:color="AAAAAA" w:sz="1"/>
+              <w:right w:val="single" w:color="AAAAAA" w:sz="1"/>
+            </w:tcBorders>
+            <w:shd w:fill="FFF2CC" w:val="clear"/>
+            <w:tcMar>
+              <w:top w:type="dxa" w:w="70"/>
+              <w:left w:type="dxa" w:w="100"/>
+              <w:bottom w:type="dxa" w:w="70"/>
+              <w:right w:type="dxa" w:w="100"/>
+            </w:tcMar>
+          </w:tcPr>
+          <w:p>
+            <w:pPr>
+              <w:jc w:val="center"/>
+            </w:pPr>
+            <w:r>
+              <w:rPr>
+                <w:rFonts w:ascii="Arial" w:cs="Arial" w:eastAsia="Arial" w:hAnsi="Arial"/>
+                <w:sz w:val="20"/>
+                <w:szCs w:val="20"/>
+              </w:rPr>
+              <w:t xml:space="preserve">0.512 ± 0.068</w:t>
+            </w:r>
+          </w:p>
+        </w:tc>
+        <w:tc>
+          <w:tcPr>
             <w:tcW w:type="dxa" w:w="1100"/>
             <w:tcBorders>
               <w:top w:val="single" w:color="AAAAAA" w:sz="1"/>
@@ -5134,13 +5917,13 @@
                 <w:sz w:val="20"/>
                 <w:szCs w:val="20"/>
               </w:rPr>
-              <w:t xml:space="preserve">0.526 ± 0.040</w:t>
-            </w:r>
-          </w:p>
-        </w:tc>
-        <w:tc>
-          <w:tcPr>
-            <w:tcW w:type="dxa" w:w="1000"/>
+              <w:t xml:space="preserve">0.704 ± 0.073</w:t>
+            </w:r>
+          </w:p>
+        </w:tc>
+        <w:tc>
+          <w:tcPr>
+            <w:tcW w:type="dxa" w:w="1100"/>
             <w:tcBorders>
               <w:top w:val="single" w:color="AAAAAA" w:sz="1"/>
               <w:left w:val="single" w:color="AAAAAA" w:sz="1"/>
@@ -5165,13 +5948,13 @@
                 <w:sz w:val="20"/>
                 <w:szCs w:val="20"/>
               </w:rPr>
-              <w:t xml:space="preserve">0.512 ± 0.068</w:t>
-            </w:r>
-          </w:p>
-        </w:tc>
-        <w:tc>
-          <w:tcPr>
-            <w:tcW w:type="dxa" w:w="800"/>
+              <w:t xml:space="preserve">0.055 ± 0.026</w:t>
+            </w:r>
+          </w:p>
+        </w:tc>
+        <w:tc>
+          <w:tcPr>
+            <w:tcW w:type="dxa" w:w="1100"/>
             <w:tcBorders>
               <w:top w:val="single" w:color="AAAAAA" w:sz="1"/>
               <w:left w:val="single" w:color="AAAAAA" w:sz="1"/>
@@ -5196,13 +5979,13 @@
                 <w:sz w:val="20"/>
                 <w:szCs w:val="20"/>
               </w:rPr>
-              <w:t xml:space="preserve">0.704</w:t>
-            </w:r>
-          </w:p>
-        </w:tc>
-        <w:tc>
-          <w:tcPr>
-            <w:tcW w:type="dxa" w:w="800"/>
+              <w:t xml:space="preserve">0.720 ± 0.053</w:t>
+            </w:r>
+          </w:p>
+        </w:tc>
+        <w:tc>
+          <w:tcPr>
+            <w:tcW w:type="dxa" w:w="1100"/>
             <w:tcBorders>
               <w:top w:val="single" w:color="AAAAAA" w:sz="1"/>
               <w:left w:val="single" w:color="AAAAAA" w:sz="1"/>
@@ -5227,13 +6010,13 @@
                 <w:sz w:val="20"/>
                 <w:szCs w:val="20"/>
               </w:rPr>
-              <w:t xml:space="preserve">0.055</w:t>
-            </w:r>
-          </w:p>
-        </w:tc>
-        <w:tc>
-          <w:tcPr>
-            <w:tcW w:type="dxa" w:w="800"/>
+              <w:t xml:space="preserve">0.499 ± 0.176</w:t>
+            </w:r>
+          </w:p>
+        </w:tc>
+        <w:tc>
+          <w:tcPr>
+            <w:tcW w:type="dxa" w:w="1100"/>
             <w:tcBorders>
               <w:top w:val="single" w:color="AAAAAA" w:sz="1"/>
               <w:left w:val="single" w:color="AAAAAA" w:sz="1"/>
@@ -5258,69 +6041,7 @@
                 <w:sz w:val="20"/>
                 <w:szCs w:val="20"/>
               </w:rPr>
-              <w:t xml:space="preserve">0.720</w:t>
-            </w:r>
-          </w:p>
-        </w:tc>
-        <w:tc>
-          <w:tcPr>
-            <w:tcW w:type="dxa" w:w="800"/>
-            <w:tcBorders>
-              <w:top w:val="single" w:color="AAAAAA" w:sz="1"/>
-              <w:left w:val="single" w:color="AAAAAA" w:sz="1"/>
-              <w:bottom w:val="single" w:color="AAAAAA" w:sz="1"/>
-              <w:right w:val="single" w:color="AAAAAA" w:sz="1"/>
-            </w:tcBorders>
-            <w:shd w:fill="FFF2CC" w:val="clear"/>
-            <w:tcMar>
-              <w:top w:type="dxa" w:w="70"/>
-              <w:left w:type="dxa" w:w="100"/>
-              <w:bottom w:type="dxa" w:w="70"/>
-              <w:right w:type="dxa" w:w="100"/>
-            </w:tcMar>
-          </w:tcPr>
-          <w:p>
-            <w:pPr>
-              <w:jc w:val="center"/>
-            </w:pPr>
-            <w:r>
-              <w:rPr>
-                <w:rFonts w:ascii="Arial" w:cs="Arial" w:eastAsia="Arial" w:hAnsi="Arial"/>
-                <w:sz w:val="20"/>
-                <w:szCs w:val="20"/>
-              </w:rPr>
-              <w:t xml:space="preserve">0.499</w:t>
-            </w:r>
-          </w:p>
-        </w:tc>
-        <w:tc>
-          <w:tcPr>
-            <w:tcW w:type="dxa" w:w="860"/>
-            <w:tcBorders>
-              <w:top w:val="single" w:color="AAAAAA" w:sz="1"/>
-              <w:left w:val="single" w:color="AAAAAA" w:sz="1"/>
-              <w:bottom w:val="single" w:color="AAAAAA" w:sz="1"/>
-              <w:right w:val="single" w:color="AAAAAA" w:sz="1"/>
-            </w:tcBorders>
-            <w:shd w:fill="FFF2CC" w:val="clear"/>
-            <w:tcMar>
-              <w:top w:type="dxa" w:w="70"/>
-              <w:left w:type="dxa" w:w="100"/>
-              <w:bottom w:type="dxa" w:w="70"/>
-              <w:right w:type="dxa" w:w="100"/>
-            </w:tcMar>
-          </w:tcPr>
-          <w:p>
-            <w:pPr>
-              <w:jc w:val="center"/>
-            </w:pPr>
-            <w:r>
-              <w:rPr>
-                <w:rFonts w:ascii="Arial" w:cs="Arial" w:eastAsia="Arial" w:hAnsi="Arial"/>
-                <w:sz w:val="20"/>
-                <w:szCs w:val="20"/>
-              </w:rPr>
-              <w:t xml:space="preserve">0.665</w:t>
+              <w:t xml:space="preserve">0.665 ± 0.019</w:t>
             </w:r>
           </w:p>
         </w:tc>
@@ -5340,6 +6061,22 @@
           <w:szCs w:val="20"/>
         </w:rPr>
         <w:t xml:space="preserve">PhyG SHHS zs macroF1 = 0.529 显著高于 paper OLD baseline 0.486（+4.3pt），仅次于 DeepSleepNet (已移除) 0.546。PhyG 在 N3 F1 = 0.495 显著领先所有 baseline，验证 mechanism alignment 对 N3 识别的关键贡献。</w:t>
+      </w:r>
+    </w:p>
+    <w:p>
+      <w:pPr>
+        <w:spacing w:after="100"/>
+      </w:pPr>
+      <w:r>
+        <w:rPr>
+          <w:rFonts w:ascii="Arial" w:cs="Arial" w:eastAsia="Arial" w:hAnsi="Arial"/>
+          <w:i/>
+          <w:iCs/>
+          <w:color w:val="555555"/>
+          <w:sz w:val="20"/>
+          <w:szCs w:val="20"/>
+        </w:rPr>
+        <w:t xml:space="preserve">注：所有 baseline 模型均在统一的 Sleep-EDF-78 数据集 + 相同 subject 80/10/10 split + 同样的 6 个随机种子 (42-47) 上从头训练 (controlled OLD protocol)，PhyG winner 在 5 个种子 (42-46) 上训练。所有数值均在剩余的 test 划分上计算，每个 cell 为 mean ± std。</w:t>
       </w:r>
     </w:p>
     <w:p>

</xml_diff>

<commit_message>
Update docx: ISRUC fewshot rows now reflect 6-base-seed numbers (n=17-18/cell)
</commit_message>
<xml_diff>
--- a/docs/PhyGProNet_Supervisor_Report.docx
+++ b/docs/PhyGProNet_Supervisor_Report.docx
@@ -7538,7 +7538,7 @@
                 <w:sz w:val="20"/>
                 <w:szCs w:val="20"/>
               </w:rPr>
-              <w:t xml:space="preserve">0.262 ± 0.027</w:t>
+              <w:t xml:space="preserve">0.263 ± 0.030</w:t>
             </w:r>
           </w:p>
         </w:tc>
@@ -7568,7 +7568,7 @@
                 <w:sz w:val="20"/>
                 <w:szCs w:val="20"/>
               </w:rPr>
-              <w:t xml:space="preserve">0.378 ± 0.057</w:t>
+              <w:t xml:space="preserve">0.365 ± 0.062</w:t>
             </w:r>
           </w:p>
         </w:tc>
@@ -7598,7 +7598,7 @@
                 <w:sz w:val="20"/>
                 <w:szCs w:val="20"/>
               </w:rPr>
-              <w:t xml:space="preserve">0.481 ± 0.061</w:t>
+              <w:t xml:space="preserve">0.466 ± 0.066</w:t>
             </w:r>
           </w:p>
         </w:tc>

</xml_diff>